<commit_message>
chore: update calculation book templates
</commit_message>
<xml_diff>
--- a/documents_bin/calculation_book/核岛厂房计算书.docx
+++ b/documents_bin/calculation_book/核岛厂房计算书.docx
@@ -1,6 +1,6 @@
 
 <file path=word/document.xml><?xml version="1.0" encoding="utf-8"?>
-<w:document xmlns:wpc="http://schemas.microsoft.com/office/word/2010/wordprocessingCanvas" xmlns:cx="http://schemas.microsoft.com/office/drawing/2014/chartex" xmlns:cx1="http://schemas.microsoft.com/office/drawing/2015/9/8/chartex" xmlns:cx2="http://schemas.microsoft.com/office/drawing/2015/10/21/chartex" xmlns:cx3="http://schemas.microsoft.com/office/drawing/2016/5/9/chartex" xmlns:cx4="http://schemas.microsoft.com/office/drawing/2016/5/10/chartex" xmlns:cx5="http://schemas.microsoft.com/office/drawing/2016/5/11/chartex" xmlns:cx6="http://schemas.microsoft.com/office/drawing/2016/5/12/chartex" xmlns:cx7="http://schemas.microsoft.com/office/drawing/2016/5/13/chartex" xmlns:cx8="http://schemas.microsoft.com/office/drawing/2016/5/14/chartex" xmlns:mc="http://schemas.openxmlformats.org/markup-compatibility/2006" xmlns:aink="http://schemas.microsoft.com/office/drawing/2016/ink" xmlns:am3d="http://schemas.microsoft.com/office/drawing/2017/model3d" xmlns:o="urn:schemas-microsoft-com:office:office" xmlns:oel="http://schemas.microsoft.com/office/2019/extlst" xmlns:r="http://schemas.openxmlformats.org/officeDocument/2006/relationships" xmlns:m="http://schemas.openxmlformats.org/officeDocument/2006/math" xmlns:v="urn:schemas-microsoft-com:vml" xmlns:wp14="http://schemas.microsoft.com/office/word/2010/wordprocessingDrawing" xmlns:wp="http://schemas.openxmlformats.org/drawingml/2006/wordprocessingDrawing" xmlns:w10="urn:schemas-microsoft-com:office:word" xmlns:w="http://schemas.openxmlformats.org/wordprocessingml/2006/main" xmlns:w14="http://schemas.microsoft.com/office/word/2010/wordml" xmlns:w15="http://schemas.microsoft.com/office/word/2012/wordml" xmlns:w16cex="http://schemas.microsoft.com/office/word/2018/wordml/cex" xmlns:w16cid="http://schemas.microsoft.com/office/word/2016/wordml/cid" xmlns:w16="http://schemas.microsoft.com/office/word/2018/wordml" xmlns:w16du="http://schemas.microsoft.com/office/word/2023/wordml/word16du" xmlns:w16sdtdh="http://schemas.microsoft.com/office/word/2020/wordml/sdtdatahash" xmlns:w16sdtfl="http://schemas.microsoft.com/office/word/2024/wordml/sdtformatlock" xmlns:w16se="http://schemas.microsoft.com/office/word/2015/wordml/symex" xmlns:wpg="http://schemas.microsoft.com/office/word/2010/wordprocessingGroup" xmlns:wpi="http://schemas.microsoft.com/office/word/2010/wordprocessingInk" xmlns:wne="http://schemas.microsoft.com/office/word/2006/wordml" xmlns:wps="http://schemas.microsoft.com/office/word/2010/wordprocessingShape" mc:Ignorable="w14 w15 w16se w16cid w16 w16cex w16sdtdh w16sdtfl w16du wp14">
+<w:document xmlns:wpc="http://schemas.microsoft.com/office/word/2010/wordprocessingCanvas" xmlns:cx="http://schemas.microsoft.com/office/drawing/2014/chartex" xmlns:cx1="http://schemas.microsoft.com/office/drawing/2015/9/8/chartex" xmlns:cx2="http://schemas.microsoft.com/office/drawing/2015/10/21/chartex" xmlns:cx3="http://schemas.microsoft.com/office/drawing/2016/5/9/chartex" xmlns:cx4="http://schemas.microsoft.com/office/drawing/2016/5/10/chartex" xmlns:cx5="http://schemas.microsoft.com/office/drawing/2016/5/11/chartex" xmlns:cx6="http://schemas.microsoft.com/office/drawing/2016/5/12/chartex" xmlns:cx7="http://schemas.microsoft.com/office/drawing/2016/5/13/chartex" xmlns:cx8="http://schemas.microsoft.com/office/drawing/2016/5/14/chartex" xmlns:mc="http://schemas.openxmlformats.org/markup-compatibility/2006" xmlns:aink="http://schemas.microsoft.com/office/drawing/2016/ink" xmlns:am3d="http://schemas.microsoft.com/office/drawing/2017/model3d" xmlns:o="urn:schemas-microsoft-com:office:office" xmlns:r="http://schemas.openxmlformats.org/officeDocument/2006/relationships" xmlns:m="http://schemas.openxmlformats.org/officeDocument/2006/math" xmlns:v="urn:schemas-microsoft-com:vml" xmlns:wp14="http://schemas.microsoft.com/office/word/2010/wordprocessingDrawing" xmlns:wp="http://schemas.openxmlformats.org/drawingml/2006/wordprocessingDrawing" xmlns:w10="urn:schemas-microsoft-com:office:word" xmlns:w="http://schemas.openxmlformats.org/wordprocessingml/2006/main" xmlns:w14="http://schemas.microsoft.com/office/word/2010/wordml" xmlns:w15="http://schemas.microsoft.com/office/word/2012/wordml" xmlns:w16cex="http://schemas.microsoft.com/office/word/2018/wordml/cex" xmlns:w16cid="http://schemas.microsoft.com/office/word/2016/wordml/cid" xmlns:w16="http://schemas.microsoft.com/office/word/2018/wordml" xmlns:w16se="http://schemas.microsoft.com/office/word/2015/wordml/symex" xmlns:wpg="http://schemas.microsoft.com/office/word/2010/wordprocessingGroup" xmlns:wpi="http://schemas.microsoft.com/office/word/2010/wordprocessingInk" xmlns:wne="http://schemas.microsoft.com/office/word/2006/wordml" xmlns:wps="http://schemas.microsoft.com/office/word/2010/wordprocessingShape" mc:Ignorable="w14 w15 w16se w16cid w16 w16cex wp14">
   <w:body>
     <w:tbl>
       <w:tblPr>
@@ -421,7 +421,7 @@
               <w:spacing w:line="0" w:lineRule="atLeast"/>
               <w:jc w:val="center"/>
               <w:rPr>
-                <w:rFonts w:ascii="黑体" w:eastAsia="黑体" w:hAnsi="黑体" w:hint="eastAsia"/>
+                <w:rFonts w:ascii="黑体" w:eastAsia="黑体" w:hAnsi="黑体"/>
                 <w:sz w:val="26"/>
                 <w:szCs w:val="26"/>
               </w:rPr>
@@ -442,7 +442,7 @@
               <w:spacing w:line="0" w:lineRule="atLeast"/>
               <w:jc w:val="center"/>
               <w:rPr>
-                <w:rFonts w:ascii="黑体" w:eastAsia="黑体" w:hAnsi="黑体" w:hint="eastAsia"/>
+                <w:rFonts w:ascii="黑体" w:eastAsia="黑体" w:hAnsi="黑体"/>
                 <w:sz w:val="26"/>
                 <w:szCs w:val="26"/>
               </w:rPr>
@@ -462,7 +462,7 @@
               <w:spacing w:line="0" w:lineRule="atLeast"/>
               <w:jc w:val="center"/>
               <w:rPr>
-                <w:rFonts w:ascii="黑体" w:eastAsia="黑体" w:hAnsi="黑体" w:hint="eastAsia"/>
+                <w:rFonts w:ascii="黑体" w:eastAsia="黑体" w:hAnsi="黑体"/>
                 <w:sz w:val="26"/>
                 <w:szCs w:val="26"/>
               </w:rPr>
@@ -483,7 +483,7 @@
               <w:spacing w:line="0" w:lineRule="atLeast"/>
               <w:jc w:val="center"/>
               <w:rPr>
-                <w:rFonts w:ascii="黑体" w:eastAsia="黑体" w:hAnsi="黑体" w:hint="eastAsia"/>
+                <w:rFonts w:ascii="黑体" w:eastAsia="黑体" w:hAnsi="黑体"/>
                 <w:sz w:val="26"/>
                 <w:szCs w:val="26"/>
               </w:rPr>
@@ -504,7 +504,7 @@
               <w:spacing w:line="0" w:lineRule="atLeast"/>
               <w:jc w:val="center"/>
               <w:rPr>
-                <w:rFonts w:ascii="黑体" w:eastAsia="黑体" w:hAnsi="黑体" w:hint="eastAsia"/>
+                <w:rFonts w:ascii="黑体" w:eastAsia="黑体" w:hAnsi="黑体"/>
                 <w:sz w:val="26"/>
                 <w:szCs w:val="26"/>
               </w:rPr>
@@ -525,7 +525,7 @@
               <w:spacing w:line="0" w:lineRule="atLeast"/>
               <w:jc w:val="center"/>
               <w:rPr>
-                <w:rFonts w:ascii="黑体" w:eastAsia="黑体" w:hAnsi="黑体" w:hint="eastAsia"/>
+                <w:rFonts w:ascii="黑体" w:eastAsia="黑体" w:hAnsi="黑体"/>
                 <w:sz w:val="26"/>
                 <w:szCs w:val="26"/>
               </w:rPr>
@@ -546,7 +546,7 @@
               <w:spacing w:line="0" w:lineRule="atLeast"/>
               <w:jc w:val="center"/>
               <w:rPr>
-                <w:rFonts w:ascii="黑体" w:eastAsia="黑体" w:hAnsi="黑体" w:hint="eastAsia"/>
+                <w:rFonts w:ascii="黑体" w:eastAsia="黑体" w:hAnsi="黑体"/>
                 <w:sz w:val="26"/>
                 <w:szCs w:val="26"/>
               </w:rPr>
@@ -567,7 +567,7 @@
               <w:spacing w:line="0" w:lineRule="atLeast"/>
               <w:jc w:val="center"/>
               <w:rPr>
-                <w:rFonts w:ascii="黑体" w:eastAsia="黑体" w:hAnsi="黑体" w:hint="eastAsia"/>
+                <w:rFonts w:ascii="黑体" w:eastAsia="黑体" w:hAnsi="黑体"/>
                 <w:sz w:val="26"/>
                 <w:szCs w:val="26"/>
               </w:rPr>
@@ -588,7 +588,7 @@
               <w:spacing w:line="0" w:lineRule="atLeast"/>
               <w:jc w:val="center"/>
               <w:rPr>
-                <w:rFonts w:ascii="黑体" w:eastAsia="黑体" w:hAnsi="黑体" w:hint="eastAsia"/>
+                <w:rFonts w:ascii="黑体" w:eastAsia="黑体" w:hAnsi="黑体"/>
                 <w:sz w:val="26"/>
                 <w:szCs w:val="26"/>
               </w:rPr>
@@ -609,7 +609,7 @@
               <w:spacing w:line="0" w:lineRule="atLeast"/>
               <w:jc w:val="center"/>
               <w:rPr>
-                <w:rFonts w:ascii="黑体" w:eastAsia="黑体" w:hAnsi="黑体" w:hint="eastAsia"/>
+                <w:rFonts w:ascii="黑体" w:eastAsia="黑体" w:hAnsi="黑体"/>
                 <w:sz w:val="26"/>
                 <w:szCs w:val="26"/>
               </w:rPr>
@@ -629,7 +629,7 @@
               <w:spacing w:line="0" w:lineRule="atLeast"/>
               <w:jc w:val="center"/>
               <w:rPr>
-                <w:rFonts w:ascii="黑体" w:eastAsia="黑体" w:hAnsi="黑体" w:hint="eastAsia"/>
+                <w:rFonts w:ascii="黑体" w:eastAsia="黑体" w:hAnsi="黑体"/>
                 <w:sz w:val="26"/>
                 <w:szCs w:val="26"/>
               </w:rPr>
@@ -652,7 +652,7 @@
               <w:spacing w:line="0" w:lineRule="atLeast"/>
               <w:jc w:val="center"/>
               <w:rPr>
-                <w:rFonts w:ascii="黑体" w:eastAsia="黑体" w:hAnsi="黑体" w:hint="eastAsia"/>
+                <w:rFonts w:ascii="黑体" w:eastAsia="黑体" w:hAnsi="黑体"/>
                 <w:sz w:val="26"/>
                 <w:szCs w:val="26"/>
               </w:rPr>
@@ -679,7 +679,7 @@
               <w:spacing w:line="0" w:lineRule="atLeast"/>
               <w:jc w:val="center"/>
               <w:rPr>
-                <w:rFonts w:ascii="黑体" w:eastAsia="黑体" w:hAnsi="黑体" w:hint="eastAsia"/>
+                <w:rFonts w:ascii="黑体" w:eastAsia="黑体" w:hAnsi="黑体"/>
                 <w:sz w:val="26"/>
                 <w:szCs w:val="26"/>
               </w:rPr>
@@ -710,7 +710,7 @@
               <w:spacing w:line="0" w:lineRule="atLeast"/>
               <w:jc w:val="center"/>
               <w:rPr>
-                <w:rFonts w:ascii="黑体" w:eastAsia="黑体" w:hAnsi="黑体" w:hint="eastAsia"/>
+                <w:rFonts w:ascii="黑体" w:eastAsia="黑体" w:hAnsi="黑体"/>
                 <w:sz w:val="26"/>
                 <w:szCs w:val="26"/>
               </w:rPr>
@@ -731,7 +731,7 @@
               <w:spacing w:line="0" w:lineRule="atLeast"/>
               <w:jc w:val="center"/>
               <w:rPr>
-                <w:rFonts w:ascii="黑体" w:eastAsia="黑体" w:hAnsi="黑体" w:hint="eastAsia"/>
+                <w:rFonts w:ascii="黑体" w:eastAsia="黑体" w:hAnsi="黑体"/>
                 <w:sz w:val="26"/>
                 <w:szCs w:val="26"/>
               </w:rPr>
@@ -782,7 +782,7 @@
               <w:spacing w:line="0" w:lineRule="atLeast"/>
               <w:jc w:val="center"/>
               <w:rPr>
-                <w:rFonts w:ascii="黑体" w:eastAsia="黑体" w:hAnsi="黑体" w:hint="eastAsia"/>
+                <w:rFonts w:ascii="黑体" w:eastAsia="黑体" w:hAnsi="黑体"/>
                 <w:sz w:val="26"/>
                 <w:szCs w:val="26"/>
               </w:rPr>
@@ -803,7 +803,7 @@
               <w:spacing w:line="0" w:lineRule="atLeast"/>
               <w:jc w:val="center"/>
               <w:rPr>
-                <w:rFonts w:ascii="黑体" w:eastAsia="黑体" w:hAnsi="黑体" w:hint="eastAsia"/>
+                <w:rFonts w:ascii="黑体" w:eastAsia="黑体" w:hAnsi="黑体"/>
                 <w:sz w:val="26"/>
                 <w:szCs w:val="26"/>
               </w:rPr>
@@ -823,7 +823,7 @@
               <w:spacing w:line="0" w:lineRule="atLeast"/>
               <w:jc w:val="center"/>
               <w:rPr>
-                <w:rFonts w:ascii="黑体" w:eastAsia="黑体" w:hAnsi="黑体" w:hint="eastAsia"/>
+                <w:rFonts w:ascii="黑体" w:eastAsia="黑体" w:hAnsi="黑体"/>
                 <w:sz w:val="26"/>
                 <w:szCs w:val="26"/>
               </w:rPr>
@@ -844,7 +844,7 @@
               <w:spacing w:line="0" w:lineRule="atLeast"/>
               <w:jc w:val="center"/>
               <w:rPr>
-                <w:rFonts w:ascii="黑体" w:eastAsia="黑体" w:hAnsi="黑体" w:hint="eastAsia"/>
+                <w:rFonts w:ascii="黑体" w:eastAsia="黑体" w:hAnsi="黑体"/>
                 <w:sz w:val="26"/>
                 <w:szCs w:val="26"/>
               </w:rPr>
@@ -865,7 +865,7 @@
               <w:spacing w:line="0" w:lineRule="atLeast"/>
               <w:jc w:val="center"/>
               <w:rPr>
-                <w:rFonts w:ascii="黑体" w:eastAsia="黑体" w:hAnsi="黑体" w:hint="eastAsia"/>
+                <w:rFonts w:ascii="黑体" w:eastAsia="黑体" w:hAnsi="黑体"/>
                 <w:sz w:val="26"/>
                 <w:szCs w:val="26"/>
               </w:rPr>
@@ -886,7 +886,7 @@
               <w:spacing w:line="0" w:lineRule="atLeast"/>
               <w:jc w:val="center"/>
               <w:rPr>
-                <w:rFonts w:ascii="黑体" w:eastAsia="黑体" w:hAnsi="黑体" w:hint="eastAsia"/>
+                <w:rFonts w:ascii="黑体" w:eastAsia="黑体" w:hAnsi="黑体"/>
                 <w:sz w:val="26"/>
                 <w:szCs w:val="26"/>
               </w:rPr>
@@ -907,7 +907,7 @@
               <w:spacing w:line="0" w:lineRule="atLeast"/>
               <w:jc w:val="center"/>
               <w:rPr>
-                <w:rFonts w:ascii="黑体" w:eastAsia="黑体" w:hAnsi="黑体" w:hint="eastAsia"/>
+                <w:rFonts w:ascii="黑体" w:eastAsia="黑体" w:hAnsi="黑体"/>
                 <w:sz w:val="26"/>
                 <w:szCs w:val="26"/>
               </w:rPr>
@@ -928,7 +928,7 @@
               <w:spacing w:line="0" w:lineRule="atLeast"/>
               <w:jc w:val="center"/>
               <w:rPr>
-                <w:rFonts w:ascii="黑体" w:eastAsia="黑体" w:hAnsi="黑体" w:hint="eastAsia"/>
+                <w:rFonts w:ascii="黑体" w:eastAsia="黑体" w:hAnsi="黑体"/>
                 <w:sz w:val="26"/>
                 <w:szCs w:val="26"/>
               </w:rPr>
@@ -949,7 +949,7 @@
               <w:spacing w:line="0" w:lineRule="atLeast"/>
               <w:jc w:val="center"/>
               <w:rPr>
-                <w:rFonts w:ascii="黑体" w:eastAsia="黑体" w:hAnsi="黑体" w:hint="eastAsia"/>
+                <w:rFonts w:ascii="黑体" w:eastAsia="黑体" w:hAnsi="黑体"/>
                 <w:sz w:val="26"/>
                 <w:szCs w:val="26"/>
               </w:rPr>
@@ -970,7 +970,7 @@
               <w:spacing w:line="0" w:lineRule="atLeast"/>
               <w:jc w:val="center"/>
               <w:rPr>
-                <w:rFonts w:ascii="黑体" w:eastAsia="黑体" w:hAnsi="黑体" w:hint="eastAsia"/>
+                <w:rFonts w:ascii="黑体" w:eastAsia="黑体" w:hAnsi="黑体"/>
                 <w:sz w:val="26"/>
                 <w:szCs w:val="26"/>
               </w:rPr>
@@ -990,7 +990,7 @@
               <w:spacing w:line="0" w:lineRule="atLeast"/>
               <w:jc w:val="center"/>
               <w:rPr>
-                <w:rFonts w:ascii="黑体" w:eastAsia="黑体" w:hAnsi="黑体" w:hint="eastAsia"/>
+                <w:rFonts w:ascii="黑体" w:eastAsia="黑体" w:hAnsi="黑体"/>
                 <w:sz w:val="26"/>
                 <w:szCs w:val="26"/>
               </w:rPr>
@@ -1013,7 +1013,7 @@
               <w:spacing w:line="0" w:lineRule="atLeast"/>
               <w:jc w:val="center"/>
               <w:rPr>
-                <w:rFonts w:ascii="黑体" w:eastAsia="黑体" w:hAnsi="黑体" w:hint="eastAsia"/>
+                <w:rFonts w:ascii="黑体" w:eastAsia="黑体" w:hAnsi="黑体"/>
                 <w:sz w:val="26"/>
                 <w:szCs w:val="26"/>
               </w:rPr>
@@ -1040,7 +1040,7 @@
               <w:spacing w:line="0" w:lineRule="atLeast"/>
               <w:jc w:val="center"/>
               <w:rPr>
-                <w:rFonts w:ascii="黑体" w:eastAsia="黑体" w:hAnsi="黑体" w:hint="eastAsia"/>
+                <w:rFonts w:ascii="黑体" w:eastAsia="黑体" w:hAnsi="黑体"/>
                 <w:sz w:val="26"/>
                 <w:szCs w:val="26"/>
               </w:rPr>
@@ -1121,7 +1121,7 @@
               <w:spacing w:line="0" w:lineRule="atLeast"/>
               <w:jc w:val="center"/>
               <w:rPr>
-                <w:rFonts w:ascii="黑体" w:eastAsia="黑体" w:hAnsi="黑体" w:hint="eastAsia"/>
+                <w:rFonts w:ascii="黑体" w:eastAsia="黑体" w:hAnsi="黑体"/>
                 <w:sz w:val="26"/>
                 <w:szCs w:val="26"/>
               </w:rPr>
@@ -1142,7 +1142,7 @@
               <w:spacing w:line="0" w:lineRule="atLeast"/>
               <w:jc w:val="center"/>
               <w:rPr>
-                <w:rFonts w:ascii="黑体" w:eastAsia="黑体" w:hAnsi="黑体" w:hint="eastAsia"/>
+                <w:rFonts w:ascii="黑体" w:eastAsia="黑体" w:hAnsi="黑体"/>
                 <w:sz w:val="26"/>
                 <w:szCs w:val="26"/>
               </w:rPr>
@@ -1193,7 +1193,7 @@
               <w:spacing w:line="0" w:lineRule="atLeast"/>
               <w:jc w:val="center"/>
               <w:rPr>
-                <w:rFonts w:ascii="黑体" w:eastAsia="黑体" w:hAnsi="黑体" w:hint="eastAsia"/>
+                <w:rFonts w:ascii="黑体" w:eastAsia="黑体" w:hAnsi="黑体"/>
                 <w:sz w:val="26"/>
                 <w:szCs w:val="26"/>
               </w:rPr>
@@ -1214,7 +1214,7 @@
               <w:spacing w:line="0" w:lineRule="atLeast"/>
               <w:jc w:val="center"/>
               <w:rPr>
-                <w:rFonts w:ascii="黑体" w:eastAsia="黑体" w:hAnsi="黑体" w:hint="eastAsia"/>
+                <w:rFonts w:ascii="黑体" w:eastAsia="黑体" w:hAnsi="黑体"/>
                 <w:sz w:val="26"/>
                 <w:szCs w:val="26"/>
               </w:rPr>
@@ -1251,7 +1251,7 @@
               <w:spacing w:line="0" w:lineRule="atLeast"/>
               <w:jc w:val="center"/>
               <w:rPr>
-                <w:rFonts w:ascii="黑体" w:eastAsia="黑体" w:hAnsi="黑体" w:hint="eastAsia"/>
+                <w:rFonts w:ascii="黑体" w:eastAsia="黑体" w:hAnsi="黑体"/>
                 <w:sz w:val="26"/>
                 <w:szCs w:val="26"/>
               </w:rPr>
@@ -1272,7 +1272,7 @@
               <w:spacing w:line="0" w:lineRule="atLeast"/>
               <w:jc w:val="center"/>
               <w:rPr>
-                <w:rFonts w:ascii="黑体" w:eastAsia="黑体" w:hAnsi="黑体" w:hint="eastAsia"/>
+                <w:rFonts w:ascii="黑体" w:eastAsia="黑体" w:hAnsi="黑体"/>
                 <w:sz w:val="26"/>
                 <w:szCs w:val="26"/>
               </w:rPr>
@@ -1293,7 +1293,7 @@
               <w:spacing w:line="0" w:lineRule="atLeast"/>
               <w:jc w:val="center"/>
               <w:rPr>
-                <w:rFonts w:ascii="黑体" w:eastAsia="黑体" w:hAnsi="黑体" w:hint="eastAsia"/>
+                <w:rFonts w:ascii="黑体" w:eastAsia="黑体" w:hAnsi="黑体"/>
                 <w:sz w:val="26"/>
                 <w:szCs w:val="26"/>
               </w:rPr>
@@ -1314,7 +1314,7 @@
               <w:spacing w:line="0" w:lineRule="atLeast"/>
               <w:jc w:val="center"/>
               <w:rPr>
-                <w:rFonts w:ascii="黑体" w:eastAsia="黑体" w:hAnsi="黑体" w:hint="eastAsia"/>
+                <w:rFonts w:ascii="黑体" w:eastAsia="黑体" w:hAnsi="黑体"/>
                 <w:sz w:val="26"/>
                 <w:szCs w:val="26"/>
               </w:rPr>
@@ -1335,7 +1335,7 @@
               <w:spacing w:line="0" w:lineRule="atLeast"/>
               <w:jc w:val="center"/>
               <w:rPr>
-                <w:rFonts w:ascii="黑体" w:eastAsia="黑体" w:hAnsi="黑体" w:hint="eastAsia"/>
+                <w:rFonts w:ascii="黑体" w:eastAsia="黑体" w:hAnsi="黑体"/>
                 <w:sz w:val="26"/>
                 <w:szCs w:val="26"/>
               </w:rPr>
@@ -1355,7 +1355,7 @@
               <w:spacing w:line="0" w:lineRule="atLeast"/>
               <w:jc w:val="center"/>
               <w:rPr>
-                <w:rFonts w:ascii="黑体" w:eastAsia="黑体" w:hAnsi="黑体" w:hint="eastAsia"/>
+                <w:rFonts w:ascii="黑体" w:eastAsia="黑体" w:hAnsi="黑体"/>
                 <w:sz w:val="26"/>
                 <w:szCs w:val="26"/>
               </w:rPr>
@@ -1378,7 +1378,7 @@
               <w:spacing w:line="0" w:lineRule="atLeast"/>
               <w:jc w:val="center"/>
               <w:rPr>
-                <w:rFonts w:ascii="黑体" w:eastAsia="黑体" w:hAnsi="黑体" w:hint="eastAsia"/>
+                <w:rFonts w:ascii="黑体" w:eastAsia="黑体" w:hAnsi="黑体"/>
                 <w:sz w:val="26"/>
                 <w:szCs w:val="26"/>
               </w:rPr>
@@ -1405,7 +1405,7 @@
               <w:spacing w:line="0" w:lineRule="atLeast"/>
               <w:jc w:val="center"/>
               <w:rPr>
-                <w:rFonts w:ascii="黑体" w:eastAsia="黑体" w:hAnsi="黑体" w:hint="eastAsia"/>
+                <w:rFonts w:ascii="黑体" w:eastAsia="黑体" w:hAnsi="黑体"/>
                 <w:sz w:val="26"/>
                 <w:szCs w:val="26"/>
               </w:rPr>
@@ -1434,7 +1434,7 @@
               <w:spacing w:line="0" w:lineRule="atLeast"/>
               <w:jc w:val="center"/>
               <w:rPr>
-                <w:rFonts w:ascii="黑体" w:eastAsia="黑体" w:hAnsi="黑体" w:hint="eastAsia"/>
+                <w:rFonts w:ascii="黑体" w:eastAsia="黑体" w:hAnsi="黑体"/>
                 <w:sz w:val="26"/>
                 <w:szCs w:val="26"/>
               </w:rPr>
@@ -1455,7 +1455,7 @@
               <w:spacing w:line="0" w:lineRule="atLeast"/>
               <w:jc w:val="center"/>
               <w:rPr>
-                <w:rFonts w:ascii="黑体" w:eastAsia="黑体" w:hAnsi="黑体" w:hint="eastAsia"/>
+                <w:rFonts w:ascii="黑体" w:eastAsia="黑体" w:hAnsi="黑体"/>
                 <w:sz w:val="26"/>
                 <w:szCs w:val="26"/>
               </w:rPr>
@@ -1506,7 +1506,7 @@
               <w:spacing w:line="0" w:lineRule="atLeast"/>
               <w:jc w:val="center"/>
               <w:rPr>
-                <w:rFonts w:ascii="黑体" w:eastAsia="黑体" w:hAnsi="黑体" w:hint="eastAsia"/>
+                <w:rFonts w:ascii="黑体" w:eastAsia="黑体" w:hAnsi="黑体"/>
                 <w:sz w:val="26"/>
                 <w:szCs w:val="26"/>
               </w:rPr>
@@ -1527,7 +1527,7 @@
               <w:spacing w:line="0" w:lineRule="atLeast"/>
               <w:jc w:val="center"/>
               <w:rPr>
-                <w:rFonts w:ascii="黑体" w:eastAsia="黑体" w:hAnsi="黑体" w:hint="eastAsia"/>
+                <w:rFonts w:ascii="黑体" w:eastAsia="黑体" w:hAnsi="黑体"/>
                 <w:sz w:val="26"/>
                 <w:szCs w:val="26"/>
               </w:rPr>
@@ -1547,7 +1547,7 @@
               <w:spacing w:line="0" w:lineRule="atLeast"/>
               <w:jc w:val="center"/>
               <w:rPr>
-                <w:rFonts w:ascii="黑体" w:eastAsia="黑体" w:hAnsi="黑体" w:hint="eastAsia"/>
+                <w:rFonts w:ascii="黑体" w:eastAsia="黑体" w:hAnsi="黑体"/>
                 <w:sz w:val="26"/>
                 <w:szCs w:val="26"/>
               </w:rPr>
@@ -1568,7 +1568,7 @@
               <w:spacing w:line="0" w:lineRule="atLeast"/>
               <w:jc w:val="center"/>
               <w:rPr>
-                <w:rFonts w:ascii="黑体" w:eastAsia="黑体" w:hAnsi="黑体" w:hint="eastAsia"/>
+                <w:rFonts w:ascii="黑体" w:eastAsia="黑体" w:hAnsi="黑体"/>
                 <w:sz w:val="26"/>
                 <w:szCs w:val="26"/>
               </w:rPr>
@@ -1589,7 +1589,7 @@
               <w:spacing w:line="0" w:lineRule="atLeast"/>
               <w:jc w:val="center"/>
               <w:rPr>
-                <w:rFonts w:ascii="黑体" w:eastAsia="黑体" w:hAnsi="黑体" w:hint="eastAsia"/>
+                <w:rFonts w:ascii="黑体" w:eastAsia="黑体" w:hAnsi="黑体"/>
                 <w:sz w:val="26"/>
                 <w:szCs w:val="26"/>
               </w:rPr>
@@ -1610,7 +1610,7 @@
               <w:spacing w:line="0" w:lineRule="atLeast"/>
               <w:jc w:val="center"/>
               <w:rPr>
-                <w:rFonts w:ascii="黑体" w:eastAsia="黑体" w:hAnsi="黑体" w:hint="eastAsia"/>
+                <w:rFonts w:ascii="黑体" w:eastAsia="黑体" w:hAnsi="黑体"/>
                 <w:sz w:val="26"/>
                 <w:szCs w:val="26"/>
               </w:rPr>
@@ -1631,7 +1631,7 @@
               <w:spacing w:line="0" w:lineRule="atLeast"/>
               <w:jc w:val="center"/>
               <w:rPr>
-                <w:rFonts w:ascii="黑体" w:eastAsia="黑体" w:hAnsi="黑体" w:hint="eastAsia"/>
+                <w:rFonts w:ascii="黑体" w:eastAsia="黑体" w:hAnsi="黑体"/>
                 <w:sz w:val="26"/>
                 <w:szCs w:val="26"/>
               </w:rPr>
@@ -1652,7 +1652,7 @@
               <w:spacing w:line="0" w:lineRule="atLeast"/>
               <w:jc w:val="center"/>
               <w:rPr>
-                <w:rFonts w:ascii="黑体" w:eastAsia="黑体" w:hAnsi="黑体" w:hint="eastAsia"/>
+                <w:rFonts w:ascii="黑体" w:eastAsia="黑体" w:hAnsi="黑体"/>
                 <w:sz w:val="26"/>
                 <w:szCs w:val="26"/>
               </w:rPr>
@@ -1673,7 +1673,7 @@
               <w:spacing w:line="0" w:lineRule="atLeast"/>
               <w:jc w:val="center"/>
               <w:rPr>
-                <w:rFonts w:ascii="黑体" w:eastAsia="黑体" w:hAnsi="黑体" w:hint="eastAsia"/>
+                <w:rFonts w:ascii="黑体" w:eastAsia="黑体" w:hAnsi="黑体"/>
                 <w:sz w:val="26"/>
                 <w:szCs w:val="26"/>
               </w:rPr>
@@ -1694,7 +1694,7 @@
               <w:spacing w:line="0" w:lineRule="atLeast"/>
               <w:jc w:val="center"/>
               <w:rPr>
-                <w:rFonts w:ascii="黑体" w:eastAsia="黑体" w:hAnsi="黑体" w:hint="eastAsia"/>
+                <w:rFonts w:ascii="黑体" w:eastAsia="黑体" w:hAnsi="黑体"/>
                 <w:sz w:val="26"/>
                 <w:szCs w:val="26"/>
               </w:rPr>
@@ -1714,7 +1714,7 @@
               <w:spacing w:line="0" w:lineRule="atLeast"/>
               <w:jc w:val="center"/>
               <w:rPr>
-                <w:rFonts w:ascii="黑体" w:eastAsia="黑体" w:hAnsi="黑体" w:hint="eastAsia"/>
+                <w:rFonts w:ascii="黑体" w:eastAsia="黑体" w:hAnsi="黑体"/>
                 <w:sz w:val="26"/>
                 <w:szCs w:val="26"/>
               </w:rPr>
@@ -1737,7 +1737,7 @@
               <w:spacing w:line="0" w:lineRule="atLeast"/>
               <w:jc w:val="center"/>
               <w:rPr>
-                <w:rFonts w:ascii="黑体" w:eastAsia="黑体" w:hAnsi="黑体" w:hint="eastAsia"/>
+                <w:rFonts w:ascii="黑体" w:eastAsia="黑体" w:hAnsi="黑体"/>
                 <w:sz w:val="26"/>
                 <w:szCs w:val="26"/>
               </w:rPr>
@@ -1764,7 +1764,7 @@
               <w:spacing w:line="0" w:lineRule="atLeast"/>
               <w:jc w:val="center"/>
               <w:rPr>
-                <w:rFonts w:ascii="黑体" w:eastAsia="黑体" w:hAnsi="黑体" w:hint="eastAsia"/>
+                <w:rFonts w:ascii="黑体" w:eastAsia="黑体" w:hAnsi="黑体"/>
                 <w:color w:val="EE0000"/>
                 <w:sz w:val="26"/>
                 <w:szCs w:val="26"/>
@@ -1809,7 +1809,7 @@
               <w:spacing w:line="0" w:lineRule="atLeast"/>
               <w:jc w:val="center"/>
               <w:rPr>
-                <w:rFonts w:ascii="黑体" w:eastAsia="黑体" w:hAnsi="黑体" w:hint="eastAsia"/>
+                <w:rFonts w:ascii="黑体" w:eastAsia="黑体" w:hAnsi="黑体"/>
                 <w:sz w:val="26"/>
                 <w:szCs w:val="26"/>
               </w:rPr>
@@ -1840,7 +1840,7 @@
               <w:spacing w:line="0" w:lineRule="atLeast"/>
               <w:jc w:val="center"/>
               <w:rPr>
-                <w:rFonts w:ascii="黑体" w:eastAsia="黑体" w:hAnsi="黑体" w:hint="eastAsia"/>
+                <w:rFonts w:ascii="黑体" w:eastAsia="黑体" w:hAnsi="黑体"/>
                 <w:sz w:val="26"/>
                 <w:szCs w:val="26"/>
               </w:rPr>
@@ -1861,7 +1861,7 @@
               <w:spacing w:line="0" w:lineRule="atLeast"/>
               <w:jc w:val="center"/>
               <w:rPr>
-                <w:rFonts w:ascii="黑体" w:eastAsia="黑体" w:hAnsi="黑体" w:hint="eastAsia"/>
+                <w:rFonts w:ascii="黑体" w:eastAsia="黑体" w:hAnsi="黑体"/>
                 <w:sz w:val="26"/>
                 <w:szCs w:val="26"/>
               </w:rPr>
@@ -3074,7 +3074,7 @@
               </w:tabs>
               <w:spacing w:line="0" w:lineRule="atLeast"/>
               <w:rPr>
-                <w:rFonts w:ascii="黑体" w:eastAsia="黑体" w:hAnsi="黑体" w:hint="eastAsia"/>
+                <w:rFonts w:ascii="黑体" w:eastAsia="黑体" w:hAnsi="黑体"/>
                 <w:sz w:val="32"/>
                 <w:szCs w:val="32"/>
               </w:rPr>
@@ -3122,7 +3122,7 @@
               <w:spacing w:line="0" w:lineRule="atLeast"/>
               <w:jc w:val="center"/>
               <w:rPr>
-                <w:rFonts w:ascii="黑体" w:eastAsia="黑体" w:hAnsi="黑体" w:hint="eastAsia"/>
+                <w:rFonts w:ascii="黑体" w:eastAsia="黑体" w:hAnsi="黑体"/>
                 <w:sz w:val="32"/>
                 <w:szCs w:val="32"/>
               </w:rPr>
@@ -3444,7 +3444,7 @@
               </w:tabs>
               <w:spacing w:line="0" w:lineRule="atLeast"/>
               <w:rPr>
-                <w:rFonts w:ascii="黑体" w:eastAsia="黑体" w:hAnsi="黑体" w:hint="eastAsia"/>
+                <w:rFonts w:ascii="黑体" w:eastAsia="黑体" w:hAnsi="黑体"/>
                 <w:sz w:val="32"/>
                 <w:szCs w:val="32"/>
               </w:rPr>
@@ -3463,7 +3463,7 @@
               </w:tabs>
               <w:spacing w:line="0" w:lineRule="atLeast"/>
               <w:rPr>
-                <w:rFonts w:ascii="黑体" w:eastAsia="黑体" w:hAnsi="黑体" w:hint="eastAsia"/>
+                <w:rFonts w:ascii="黑体" w:eastAsia="黑体" w:hAnsi="黑体"/>
                 <w:sz w:val="32"/>
                 <w:szCs w:val="32"/>
               </w:rPr>
@@ -3482,7 +3482,7 @@
               </w:tabs>
               <w:spacing w:line="0" w:lineRule="atLeast"/>
               <w:rPr>
-                <w:rFonts w:ascii="黑体" w:eastAsia="黑体" w:hAnsi="黑体" w:hint="eastAsia"/>
+                <w:rFonts w:ascii="黑体" w:eastAsia="黑体" w:hAnsi="黑体"/>
                 <w:sz w:val="32"/>
                 <w:szCs w:val="32"/>
               </w:rPr>
@@ -3641,7 +3641,7 @@
               </w:tabs>
               <w:spacing w:line="0" w:lineRule="atLeast"/>
               <w:rPr>
-                <w:rFonts w:ascii="黑体" w:eastAsia="黑体" w:hAnsi="黑体" w:hint="eastAsia"/>
+                <w:rFonts w:ascii="黑体" w:eastAsia="黑体" w:hAnsi="黑体"/>
                 <w:sz w:val="32"/>
                 <w:szCs w:val="36"/>
               </w:rPr>
@@ -3673,7 +3673,7 @@
               <w:spacing w:line="0" w:lineRule="atLeast"/>
               <w:jc w:val="center"/>
               <w:rPr>
-                <w:rFonts w:ascii="黑体" w:eastAsia="黑体" w:hAnsi="黑体" w:hint="eastAsia"/>
+                <w:rFonts w:ascii="黑体" w:eastAsia="黑体" w:hAnsi="黑体"/>
                 <w:sz w:val="32"/>
                 <w:szCs w:val="32"/>
               </w:rPr>
@@ -3995,7 +3995,7 @@
               </w:tabs>
               <w:spacing w:line="0" w:lineRule="atLeast"/>
               <w:rPr>
-                <w:rFonts w:ascii="黑体" w:eastAsia="黑体" w:hAnsi="黑体" w:hint="eastAsia"/>
+                <w:rFonts w:ascii="黑体" w:eastAsia="黑体" w:hAnsi="黑体"/>
                 <w:sz w:val="32"/>
                 <w:szCs w:val="32"/>
               </w:rPr>
@@ -4014,7 +4014,7 @@
               </w:tabs>
               <w:spacing w:line="0" w:lineRule="atLeast"/>
               <w:rPr>
-                <w:rFonts w:ascii="黑体" w:eastAsia="黑体" w:hAnsi="黑体" w:hint="eastAsia"/>
+                <w:rFonts w:ascii="黑体" w:eastAsia="黑体" w:hAnsi="黑体"/>
                 <w:sz w:val="32"/>
                 <w:szCs w:val="32"/>
               </w:rPr>
@@ -4033,7 +4033,7 @@
               </w:tabs>
               <w:spacing w:line="0" w:lineRule="atLeast"/>
               <w:rPr>
-                <w:rFonts w:ascii="黑体" w:eastAsia="黑体" w:hAnsi="黑体" w:hint="eastAsia"/>
+                <w:rFonts w:ascii="黑体" w:eastAsia="黑体" w:hAnsi="黑体"/>
                 <w:sz w:val="32"/>
                 <w:szCs w:val="32"/>
               </w:rPr>
@@ -4192,7 +4192,7 @@
               </w:tabs>
               <w:spacing w:line="0" w:lineRule="atLeast"/>
               <w:rPr>
-                <w:rFonts w:ascii="黑体" w:eastAsia="黑体" w:hAnsi="黑体" w:hint="eastAsia"/>
+                <w:rFonts w:ascii="黑体" w:eastAsia="黑体" w:hAnsi="黑体"/>
               </w:rPr>
             </w:pPr>
             <w:r>
@@ -4222,7 +4222,7 @@
               <w:spacing w:line="0" w:lineRule="atLeast"/>
               <w:jc w:val="center"/>
               <w:rPr>
-                <w:rFonts w:ascii="黑体" w:eastAsia="黑体" w:hAnsi="黑体" w:hint="eastAsia"/>
+                <w:rFonts w:ascii="黑体" w:eastAsia="黑体" w:hAnsi="黑体"/>
                 <w:sz w:val="32"/>
                 <w:szCs w:val="32"/>
               </w:rPr>
@@ -4544,7 +4544,7 @@
               </w:tabs>
               <w:spacing w:line="0" w:lineRule="atLeast"/>
               <w:rPr>
-                <w:rFonts w:ascii="黑体" w:eastAsia="黑体" w:hAnsi="黑体" w:hint="eastAsia"/>
+                <w:rFonts w:ascii="黑体" w:eastAsia="黑体" w:hAnsi="黑体"/>
                 <w:sz w:val="32"/>
                 <w:szCs w:val="32"/>
               </w:rPr>
@@ -4563,7 +4563,7 @@
               </w:tabs>
               <w:spacing w:line="0" w:lineRule="atLeast"/>
               <w:rPr>
-                <w:rFonts w:ascii="黑体" w:eastAsia="黑体" w:hAnsi="黑体" w:hint="eastAsia"/>
+                <w:rFonts w:ascii="黑体" w:eastAsia="黑体" w:hAnsi="黑体"/>
                 <w:sz w:val="32"/>
                 <w:szCs w:val="32"/>
               </w:rPr>
@@ -4582,7 +4582,7 @@
               </w:tabs>
               <w:spacing w:line="0" w:lineRule="atLeast"/>
               <w:rPr>
-                <w:rFonts w:ascii="黑体" w:eastAsia="黑体" w:hAnsi="黑体" w:hint="eastAsia"/>
+                <w:rFonts w:ascii="黑体" w:eastAsia="黑体" w:hAnsi="黑体"/>
                 <w:sz w:val="32"/>
                 <w:szCs w:val="32"/>
               </w:rPr>
@@ -4741,7 +4741,7 @@
               </w:tabs>
               <w:spacing w:line="0" w:lineRule="atLeast"/>
               <w:rPr>
-                <w:rFonts w:ascii="黑体" w:eastAsia="黑体" w:hAnsi="黑体" w:hint="eastAsia"/>
+                <w:rFonts w:ascii="黑体" w:eastAsia="黑体" w:hAnsi="黑体"/>
                 <w:sz w:val="30"/>
                 <w:szCs w:val="30"/>
               </w:rPr>
@@ -4789,7 +4789,7 @@
               <w:spacing w:line="0" w:lineRule="atLeast"/>
               <w:jc w:val="center"/>
               <w:rPr>
-                <w:rFonts w:ascii="黑体" w:eastAsia="黑体" w:hAnsi="黑体" w:hint="eastAsia"/>
+                <w:rFonts w:ascii="黑体" w:eastAsia="黑体" w:hAnsi="黑体"/>
                 <w:sz w:val="32"/>
                 <w:szCs w:val="32"/>
               </w:rPr>
@@ -4950,7 +4950,7 @@
                 <w:tab w:val="left" w:pos="7797"/>
               </w:tabs>
               <w:rPr>
-                <w:rFonts w:ascii="黑体" w:eastAsia="黑体" w:hAnsi="黑体" w:hint="eastAsia"/>
+                <w:rFonts w:ascii="黑体" w:eastAsia="黑体" w:hAnsi="黑体"/>
                 <w:sz w:val="30"/>
                 <w:szCs w:val="30"/>
               </w:rPr>
@@ -4969,7 +4969,7 @@
                 <w:tab w:val="left" w:pos="7797"/>
               </w:tabs>
               <w:rPr>
-                <w:rFonts w:ascii="黑体" w:eastAsia="黑体" w:hAnsi="黑体" w:hint="eastAsia"/>
+                <w:rFonts w:ascii="黑体" w:eastAsia="黑体" w:hAnsi="黑体"/>
                 <w:sz w:val="30"/>
                 <w:szCs w:val="30"/>
               </w:rPr>
@@ -4989,7 +4989,7 @@
               </w:tabs>
               <w:spacing w:line="0" w:lineRule="atLeast"/>
               <w:rPr>
-                <w:rFonts w:ascii="黑体" w:eastAsia="黑体" w:hAnsi="黑体" w:hint="eastAsia"/>
+                <w:rFonts w:ascii="黑体" w:eastAsia="黑体" w:hAnsi="黑体"/>
                 <w:sz w:val="30"/>
                 <w:szCs w:val="30"/>
               </w:rPr>
@@ -5008,7 +5008,7 @@
                 <w:tab w:val="left" w:pos="7797"/>
               </w:tabs>
               <w:rPr>
-                <w:rFonts w:ascii="黑体" w:eastAsia="黑体" w:hAnsi="黑体" w:hint="eastAsia"/>
+                <w:rFonts w:ascii="黑体" w:eastAsia="黑体" w:hAnsi="黑体"/>
                 <w:sz w:val="30"/>
                 <w:szCs w:val="30"/>
               </w:rPr>
@@ -5027,7 +5027,7 @@
                 <w:tab w:val="left" w:pos="7797"/>
               </w:tabs>
               <w:rPr>
-                <w:rFonts w:ascii="黑体" w:eastAsia="黑体" w:hAnsi="黑体" w:hint="eastAsia"/>
+                <w:rFonts w:ascii="黑体" w:eastAsia="黑体" w:hAnsi="黑体"/>
                 <w:sz w:val="30"/>
                 <w:szCs w:val="30"/>
               </w:rPr>
@@ -5325,7 +5325,7 @@
               </w:tabs>
               <w:spacing w:line="0" w:lineRule="atLeast"/>
               <w:rPr>
-                <w:rFonts w:ascii="黑体" w:eastAsia="黑体" w:hAnsi="黑体" w:hint="eastAsia"/>
+                <w:rFonts w:ascii="黑体" w:eastAsia="黑体" w:hAnsi="黑体"/>
                 <w:sz w:val="30"/>
                 <w:szCs w:val="30"/>
               </w:rPr>
@@ -5373,7 +5373,7 @@
               <w:spacing w:line="0" w:lineRule="atLeast"/>
               <w:jc w:val="center"/>
               <w:rPr>
-                <w:rFonts w:ascii="黑体" w:eastAsia="黑体" w:hAnsi="黑体" w:hint="eastAsia"/>
+                <w:rFonts w:ascii="黑体" w:eastAsia="黑体" w:hAnsi="黑体"/>
                 <w:sz w:val="32"/>
                 <w:szCs w:val="32"/>
               </w:rPr>
@@ -5719,7 +5719,7 @@
               </w:tabs>
               <w:spacing w:line="0" w:lineRule="atLeast"/>
               <w:rPr>
-                <w:rFonts w:ascii="黑体" w:eastAsia="黑体" w:hAnsi="黑体" w:hint="eastAsia"/>
+                <w:rFonts w:ascii="黑体" w:eastAsia="黑体" w:hAnsi="黑体"/>
                 <w:sz w:val="32"/>
                 <w:szCs w:val="36"/>
               </w:rPr>
@@ -5751,7 +5751,7 @@
               <w:spacing w:line="0" w:lineRule="atLeast"/>
               <w:jc w:val="center"/>
               <w:rPr>
-                <w:rFonts w:ascii="黑体" w:eastAsia="黑体" w:hAnsi="黑体" w:hint="eastAsia"/>
+                <w:rFonts w:ascii="黑体" w:eastAsia="黑体" w:hAnsi="黑体"/>
                 <w:sz w:val="32"/>
                 <w:szCs w:val="32"/>
               </w:rPr>
@@ -5916,7 +5916,7 @@
               <w:spacing w:line="0" w:lineRule="atLeast"/>
               <w:jc w:val="center"/>
               <w:rPr>
-                <w:rFonts w:ascii="黑体" w:eastAsia="黑体" w:hAnsi="黑体" w:hint="eastAsia"/>
+                <w:rFonts w:ascii="黑体" w:eastAsia="黑体" w:hAnsi="黑体"/>
                 <w:sz w:val="32"/>
                 <w:szCs w:val="32"/>
               </w:rPr>
@@ -5941,7 +5941,7 @@
               <w:spacing w:line="0" w:lineRule="atLeast"/>
               <w:jc w:val="center"/>
               <w:rPr>
-                <w:rFonts w:ascii="黑体" w:eastAsia="黑体" w:hAnsi="黑体" w:hint="eastAsia"/>
+                <w:rFonts w:ascii="黑体" w:eastAsia="黑体" w:hAnsi="黑体"/>
                 <w:sz w:val="32"/>
                 <w:szCs w:val="32"/>
               </w:rPr>
@@ -6418,7 +6418,7 @@
               </w:tabs>
               <w:spacing w:line="0" w:lineRule="atLeast"/>
               <w:rPr>
-                <w:rFonts w:ascii="黑体" w:eastAsia="黑体" w:hAnsi="黑体" w:hint="eastAsia"/>
+                <w:rFonts w:ascii="黑体" w:eastAsia="黑体" w:hAnsi="黑体"/>
                 <w:sz w:val="32"/>
                 <w:szCs w:val="36"/>
               </w:rPr>
@@ -6451,7 +6451,7 @@
               <w:spacing w:line="0" w:lineRule="atLeast"/>
               <w:jc w:val="center"/>
               <w:rPr>
-                <w:rFonts w:ascii="黑体" w:eastAsia="黑体" w:hAnsi="黑体" w:hint="eastAsia"/>
+                <w:rFonts w:ascii="黑体" w:eastAsia="黑体" w:hAnsi="黑体"/>
                 <w:sz w:val="32"/>
                 <w:szCs w:val="32"/>
               </w:rPr>
@@ -6966,7 +6966,7 @@
               </w:tabs>
               <w:spacing w:line="0" w:lineRule="atLeast"/>
               <w:rPr>
-                <w:rFonts w:ascii="黑体" w:eastAsia="黑体" w:hAnsi="黑体" w:hint="eastAsia"/>
+                <w:rFonts w:ascii="黑体" w:eastAsia="黑体" w:hAnsi="黑体"/>
               </w:rPr>
             </w:pPr>
             <w:r>
@@ -7592,7 +7592,7 @@
               <w:spacing w:line="0" w:lineRule="atLeast"/>
               <w:jc w:val="center"/>
               <w:rPr>
-                <w:rFonts w:ascii="黑体" w:eastAsia="黑体" w:hAnsi="黑体" w:hint="eastAsia"/>
+                <w:rFonts w:ascii="黑体" w:eastAsia="黑体" w:hAnsi="黑体"/>
               </w:rPr>
             </w:pPr>
             <w:r>
@@ -7623,7 +7623,7 @@
               <w:spacing w:line="0" w:lineRule="atLeast"/>
               <w:jc w:val="center"/>
               <w:rPr>
-                <w:rFonts w:ascii="黑体" w:eastAsia="黑体" w:hAnsi="黑体" w:hint="eastAsia"/>
+                <w:rFonts w:ascii="黑体" w:eastAsia="黑体" w:hAnsi="黑体"/>
               </w:rPr>
             </w:pPr>
             <w:r>
@@ -7654,7 +7654,7 @@
               <w:spacing w:line="0" w:lineRule="atLeast"/>
               <w:jc w:val="center"/>
               <w:rPr>
-                <w:rFonts w:ascii="黑体" w:eastAsia="黑体" w:hAnsi="黑体" w:hint="eastAsia"/>
+                <w:rFonts w:ascii="黑体" w:eastAsia="黑体" w:hAnsi="黑体"/>
               </w:rPr>
             </w:pPr>
             <w:r>
@@ -7685,7 +7685,7 @@
               <w:spacing w:line="0" w:lineRule="atLeast"/>
               <w:jc w:val="center"/>
               <w:rPr>
-                <w:rFonts w:ascii="黑体" w:eastAsia="黑体" w:hAnsi="黑体" w:hint="eastAsia"/>
+                <w:rFonts w:ascii="黑体" w:eastAsia="黑体" w:hAnsi="黑体"/>
               </w:rPr>
             </w:pPr>
             <w:r>
@@ -7715,7 +7715,7 @@
               <w:spacing w:line="0" w:lineRule="atLeast"/>
               <w:jc w:val="center"/>
               <w:rPr>
-                <w:rFonts w:ascii="黑体" w:eastAsia="黑体" w:hAnsi="黑体" w:hint="eastAsia"/>
+                <w:rFonts w:ascii="黑体" w:eastAsia="黑体" w:hAnsi="黑体"/>
               </w:rPr>
             </w:pPr>
             <w:r>
@@ -7745,7 +7745,7 @@
               <w:spacing w:line="0" w:lineRule="atLeast"/>
               <w:jc w:val="center"/>
               <w:rPr>
-                <w:rFonts w:ascii="黑体" w:eastAsia="黑体" w:hAnsi="黑体" w:hint="eastAsia"/>
+                <w:rFonts w:ascii="黑体" w:eastAsia="黑体" w:hAnsi="黑体"/>
               </w:rPr>
             </w:pPr>
             <w:r>
@@ -7775,7 +7775,7 @@
               <w:spacing w:line="0" w:lineRule="atLeast"/>
               <w:jc w:val="center"/>
               <w:rPr>
-                <w:rFonts w:ascii="黑体" w:eastAsia="黑体" w:hAnsi="黑体" w:hint="eastAsia"/>
+                <w:rFonts w:ascii="黑体" w:eastAsia="黑体" w:hAnsi="黑体"/>
               </w:rPr>
             </w:pPr>
             <w:r>
@@ -7805,7 +7805,7 @@
               <w:spacing w:line="0" w:lineRule="atLeast"/>
               <w:jc w:val="center"/>
               <w:rPr>
-                <w:rFonts w:ascii="黑体" w:eastAsia="黑体" w:hAnsi="黑体" w:hint="eastAsia"/>
+                <w:rFonts w:ascii="黑体" w:eastAsia="黑体" w:hAnsi="黑体"/>
               </w:rPr>
             </w:pPr>
             <w:r>
@@ -7835,7 +7835,7 @@
               <w:spacing w:line="0" w:lineRule="atLeast"/>
               <w:jc w:val="center"/>
               <w:rPr>
-                <w:rFonts w:ascii="黑体" w:eastAsia="黑体" w:hAnsi="黑体" w:hint="eastAsia"/>
+                <w:rFonts w:ascii="黑体" w:eastAsia="黑体" w:hAnsi="黑体"/>
               </w:rPr>
             </w:pPr>
             <w:r>
@@ -7866,7 +7866,7 @@
               <w:spacing w:line="0" w:lineRule="atLeast"/>
               <w:jc w:val="center"/>
               <w:rPr>
-                <w:rFonts w:ascii="黑体" w:eastAsia="黑体" w:hAnsi="黑体" w:hint="eastAsia"/>
+                <w:rFonts w:ascii="黑体" w:eastAsia="黑体" w:hAnsi="黑体"/>
               </w:rPr>
             </w:pPr>
             <w:r>
@@ -7897,7 +7897,7 @@
               <w:spacing w:line="0" w:lineRule="atLeast"/>
               <w:jc w:val="center"/>
               <w:rPr>
-                <w:rFonts w:ascii="黑体" w:eastAsia="黑体" w:hAnsi="黑体" w:hint="eastAsia"/>
+                <w:rFonts w:ascii="黑体" w:eastAsia="黑体" w:hAnsi="黑体"/>
               </w:rPr>
             </w:pPr>
             <w:r>
@@ -7928,7 +7928,7 @@
               <w:spacing w:line="0" w:lineRule="atLeast"/>
               <w:jc w:val="center"/>
               <w:rPr>
-                <w:rFonts w:ascii="黑体" w:eastAsia="黑体" w:hAnsi="黑体" w:hint="eastAsia"/>
+                <w:rFonts w:ascii="黑体" w:eastAsia="黑体" w:hAnsi="黑体"/>
               </w:rPr>
             </w:pPr>
             <w:r>
@@ -7957,7 +7957,7 @@
               </w:tabs>
               <w:jc w:val="center"/>
               <w:rPr>
-                <w:rFonts w:ascii="黑体" w:eastAsia="黑体" w:hAnsi="黑体" w:hint="eastAsia"/>
+                <w:rFonts w:ascii="黑体" w:eastAsia="黑体" w:hAnsi="黑体"/>
               </w:rPr>
             </w:pPr>
             <w:r>
@@ -8035,7 +8035,7 @@
               </w:tabs>
               <w:spacing w:line="0" w:lineRule="atLeast"/>
               <w:rPr>
-                <w:rFonts w:ascii="宋体" w:eastAsia="宋体" w:hAnsi="宋体" w:hint="eastAsia"/>
+                <w:rFonts w:ascii="宋体" w:eastAsia="宋体" w:hAnsi="宋体"/>
                 <w:sz w:val="18"/>
                 <w:szCs w:val="18"/>
               </w:rPr>
@@ -8532,7 +8532,7 @@
               <w:spacing w:line="0" w:lineRule="atLeast"/>
               <w:jc w:val="center"/>
               <w:rPr>
-                <w:rFonts w:ascii="黑体" w:eastAsia="黑体" w:hAnsi="黑体" w:hint="eastAsia"/>
+                <w:rFonts w:ascii="黑体" w:eastAsia="黑体" w:hAnsi="黑体"/>
                 <w:sz w:val="26"/>
                 <w:szCs w:val="26"/>
               </w:rPr>
@@ -8750,7 +8750,7 @@
               <w:spacing w:line="0" w:lineRule="atLeast"/>
               <w:jc w:val="center"/>
               <w:rPr>
-                <w:rFonts w:ascii="黑体" w:eastAsia="黑体" w:hAnsi="黑体" w:hint="eastAsia"/>
+                <w:rFonts w:ascii="黑体" w:eastAsia="黑体" w:hAnsi="黑体"/>
                 <w:sz w:val="26"/>
                 <w:szCs w:val="26"/>
               </w:rPr>
@@ -9211,7 +9211,7 @@
               <w:spacing w:line="0" w:lineRule="atLeast"/>
               <w:jc w:val="center"/>
               <w:rPr>
-                <w:rFonts w:ascii="黑体" w:eastAsia="黑体" w:hAnsi="黑体" w:hint="eastAsia"/>
+                <w:rFonts w:ascii="黑体" w:eastAsia="黑体" w:hAnsi="黑体"/>
                 <w:sz w:val="50"/>
                 <w:szCs w:val="50"/>
               </w:rPr>
@@ -9313,7 +9313,7 @@
               <w:spacing w:line="0" w:lineRule="atLeast"/>
               <w:jc w:val="center"/>
               <w:rPr>
-                <w:rFonts w:ascii="黑体" w:eastAsia="黑体" w:hAnsi="黑体" w:hint="eastAsia"/>
+                <w:rFonts w:ascii="黑体" w:eastAsia="黑体" w:hAnsi="黑体"/>
                 <w:sz w:val="50"/>
                 <w:szCs w:val="50"/>
               </w:rPr>
@@ -9435,7 +9435,7 @@
               <w:spacing w:line="0" w:lineRule="atLeast"/>
               <w:ind w:firstLine="1800"/>
               <w:rPr>
-                <w:rFonts w:ascii="宋体" w:eastAsia="宋体" w:hAnsi="宋体" w:hint="eastAsia"/>
+                <w:rFonts w:ascii="宋体" w:eastAsia="宋体" w:hAnsi="宋体"/>
               </w:rPr>
             </w:pPr>
             <w:r>
@@ -10596,7 +10596,6 @@
         </w:numPr>
         <w:spacing w:beforeLines="0" w:before="156"/>
         <w:rPr>
-          <w:rFonts w:hint="eastAsia"/>
           <w:kern w:val="20"/>
           <w:sz w:val="28"/>
           <w:szCs w:val="28"/>
@@ -11307,16 +11306,7 @@
           <w:bCs/>
           <w:color w:val="EE0000"/>
         </w:rPr>
-        <w:t>plant_elevation_</w:t>
-      </w:r>
-      <w:proofErr w:type="gramStart"/>
-      <w:r>
-        <w:rPr>
-          <w:b/>
-          <w:bCs/>
-          <w:color w:val="EE0000"/>
-        </w:rPr>
-        <w:t>layout</w:t>
+        <w:t>plant_elevation_layout</w:t>
       </w:r>
       <w:proofErr w:type="spellEnd"/>
       <w:r>
@@ -11333,7 +11323,6 @@
         </w:rPr>
         <w:t>}</w:t>
       </w:r>
-      <w:proofErr w:type="gramEnd"/>
       <w:r>
         <w:rPr>
           <w:rFonts w:hint="eastAsia"/>
@@ -11451,7 +11440,6 @@
         </w:numPr>
         <w:spacing w:beforeLines="0" w:before="156"/>
         <w:rPr>
-          <w:rFonts w:hint="eastAsia"/>
           <w:kern w:val="20"/>
           <w:sz w:val="28"/>
           <w:szCs w:val="28"/>
@@ -11905,22 +11893,7 @@
           <w:kern w:val="28"/>
           <w:szCs w:val="24"/>
         </w:rPr>
-        <w:t>(HAF102</w:t>
-      </w:r>
-      <w:r>
-        <w:rPr>
-          <w:rFonts w:hint="eastAsia"/>
-          <w:kern w:val="28"/>
-          <w:szCs w:val="24"/>
-        </w:rPr>
-        <w:t>-2016</w:t>
-      </w:r>
-      <w:r>
-        <w:rPr>
-          <w:kern w:val="28"/>
-          <w:szCs w:val="24"/>
-        </w:rPr>
-        <w:t>)</w:t>
+        <w:t>(HAF102)</w:t>
       </w:r>
     </w:p>
     <w:p>
@@ -11936,32 +11909,11 @@
       </w:pPr>
       <w:r>
         <w:rPr>
-          <w:kern w:val="28"/>
-          <w:szCs w:val="24"/>
-        </w:rPr>
-        <w:t>（</w:t>
-      </w:r>
-      <w:r>
-        <w:rPr>
           <w:rFonts w:hint="eastAsia"/>
           <w:kern w:val="28"/>
           <w:szCs w:val="24"/>
         </w:rPr>
-        <w:t>2</w:t>
-      </w:r>
-      <w:r>
-        <w:rPr>
-          <w:kern w:val="28"/>
-          <w:szCs w:val="24"/>
-        </w:rPr>
-        <w:t>）《核电厂的抗震设计与鉴定》</w:t>
-      </w:r>
-      <w:r>
-        <w:rPr>
-          <w:kern w:val="28"/>
-          <w:szCs w:val="24"/>
-        </w:rPr>
-        <w:t>(HAD102/02</w:t>
+        <w:t>（</w:t>
       </w:r>
       <w:r>
         <w:rPr>
@@ -11969,14 +11921,71 @@
           <w:kern w:val="28"/>
           <w:szCs w:val="24"/>
         </w:rPr>
-        <w:t>-2019</w:t>
-      </w:r>
-      <w:r>
-        <w:rPr>
+        <w:t>2</w:t>
+      </w:r>
+      <w:r>
+        <w:rPr>
+          <w:rFonts w:hint="eastAsia"/>
           <w:kern w:val="28"/>
           <w:szCs w:val="24"/>
         </w:rPr>
-        <w:t>)</w:t>
+        <w:t>）《核电厂厂址选择中的地震问题》（</w:t>
+      </w:r>
+      <w:r>
+        <w:rPr>
+          <w:kern w:val="28"/>
+          <w:szCs w:val="24"/>
+        </w:rPr>
+        <w:t>HAD101/01</w:t>
+      </w:r>
+      <w:r>
+        <w:rPr>
+          <w:rFonts w:hint="eastAsia"/>
+          <w:kern w:val="28"/>
+          <w:szCs w:val="24"/>
+        </w:rPr>
+        <w:t>）</w:t>
+      </w:r>
+    </w:p>
+    <w:p>
+      <w:pPr>
+        <w:autoSpaceDE w:val="0"/>
+        <w:autoSpaceDN w:val="0"/>
+        <w:spacing w:line="360" w:lineRule="auto"/>
+        <w:jc w:val="left"/>
+        <w:rPr>
+          <w:kern w:val="28"/>
+          <w:szCs w:val="24"/>
+        </w:rPr>
+      </w:pPr>
+      <w:r>
+        <w:rPr>
+          <w:kern w:val="28"/>
+          <w:szCs w:val="24"/>
+        </w:rPr>
+        <w:t>（</w:t>
+      </w:r>
+      <w:r>
+        <w:rPr>
+          <w:rFonts w:hint="eastAsia"/>
+          <w:kern w:val="28"/>
+          <w:szCs w:val="24"/>
+        </w:rPr>
+        <w:t>2</w:t>
+      </w:r>
+      <w:r>
+        <w:rPr>
+          <w:kern w:val="28"/>
+          <w:szCs w:val="24"/>
+        </w:rPr>
+        <w:t>）《核电厂的抗震设计与鉴定》</w:t>
+      </w:r>
+      <w:r>
+        <w:rPr>
+          <w:kern w:val="28"/>
+          <w:szCs w:val="24"/>
+        </w:rPr>
+        <w:t>(HAD102/02)</w:t>
       </w:r>
     </w:p>
     <w:p>
@@ -12316,7 +12325,6 @@
         </w:numPr>
         <w:spacing w:beforeLines="0" w:before="156"/>
         <w:rPr>
-          <w:rFonts w:hint="eastAsia"/>
           <w:kern w:val="20"/>
           <w:sz w:val="28"/>
           <w:szCs w:val="28"/>
@@ -13990,7 +13998,6 @@
         </w:numPr>
         <w:spacing w:beforeLines="0" w:before="156"/>
         <w:rPr>
-          <w:rFonts w:hint="eastAsia"/>
           <w:kern w:val="20"/>
           <w:sz w:val="28"/>
           <w:szCs w:val="28"/>
@@ -15592,7 +15599,6 @@
         </w:numPr>
         <w:spacing w:beforeLines="0" w:before="156"/>
         <w:rPr>
-          <w:rFonts w:hint="eastAsia"/>
           <w:kern w:val="20"/>
           <w:sz w:val="28"/>
           <w:szCs w:val="28"/>
@@ -16353,7 +16359,7 @@
         <w:ind w:firstLineChars="250" w:firstLine="602"/>
         <w:jc w:val="left"/>
         <w:rPr>
-          <w:rFonts w:asciiTheme="minorEastAsia" w:hAnsiTheme="minorEastAsia" w:hint="eastAsia"/>
+          <w:rFonts w:asciiTheme="minorEastAsia" w:hAnsiTheme="minorEastAsia"/>
           <w:b/>
           <w:szCs w:val="24"/>
         </w:rPr>
@@ -16962,15 +16968,13 @@
         </w:rPr>
         <w:t>三个方向的地震结果采用</w:t>
       </w:r>
-      <w:proofErr w:type="spellStart"/>
       <w:r>
         <w:rPr>
           <w:rFonts w:cs="宋体" w:hint="eastAsia"/>
           <w:szCs w:val="24"/>
         </w:rPr>
-        <w:t>newmark</w:t>
-      </w:r>
-      <w:proofErr w:type="spellEnd"/>
+        <w:t>SRSS</w:t>
+      </w:r>
       <w:r>
         <w:rPr>
           <w:rFonts w:cs="宋体" w:hint="eastAsia"/>
@@ -18082,7 +18086,7 @@
         <w:spacing w:line="360" w:lineRule="auto"/>
         <w:jc w:val="center"/>
         <w:rPr>
-          <w:rFonts w:ascii="宋体" w:eastAsia="宋体" w:hAnsi="宋体" w:cs="宋体" w:hint="eastAsia"/>
+          <w:rFonts w:ascii="宋体" w:eastAsia="宋体" w:hAnsi="宋体" w:cs="宋体"/>
           <w:szCs w:val="24"/>
         </w:rPr>
       </w:pPr>
@@ -24097,7 +24101,6 @@
         </w:numPr>
         <w:spacing w:beforeLines="0" w:before="156"/>
         <w:rPr>
-          <w:rFonts w:hint="eastAsia"/>
           <w:kern w:val="20"/>
           <w:sz w:val="28"/>
           <w:szCs w:val="28"/>
@@ -24328,28 +24331,14 @@
         <w:rPr>
           <w:color w:val="EE0000"/>
         </w:rPr>
-        <w:t>_wall_fem_calculation_</w:t>
-      </w:r>
-      <w:proofErr w:type="gramStart"/>
+        <w:t>_wall_fem_calculation_model</w:t>
+      </w:r>
+      <w:proofErr w:type="spellEnd"/>
       <w:r>
         <w:rPr>
           <w:color w:val="EE0000"/>
         </w:rPr>
-        <w:t>model</w:t>
-      </w:r>
-      <w:proofErr w:type="spellEnd"/>
-      <w:r>
-        <w:rPr>
-          <w:color w:val="EE0000"/>
-        </w:rPr>
-        <w:t xml:space="preserve"> }</w:t>
-      </w:r>
-      <w:proofErr w:type="gramEnd"/>
-      <w:r>
-        <w:rPr>
-          <w:color w:val="EE0000"/>
-        </w:rPr>
-        <w:t>}</w:t>
+        <w:t xml:space="preserve"> }}</w:t>
       </w:r>
       <w:r>
         <w:rPr>
@@ -24859,7 +24848,6 @@
         </w:numPr>
         <w:spacing w:beforeLines="0" w:before="156"/>
         <w:rPr>
-          <w:rFonts w:hint="eastAsia"/>
           <w:kern w:val="20"/>
           <w:sz w:val="28"/>
           <w:szCs w:val="28"/>
@@ -24891,7 +24879,37 @@
         <w:rPr>
           <w:b/>
         </w:rPr>
-        <w:t>7.1 {% if include_slab_stress %}楼板与墙体单侧{% else %}墙体{% endif %}配筋计算结果</w:t>
+        <w:t>7.1 {% if include_slab_stress %}</w:t>
+      </w:r>
+      <w:r>
+        <w:rPr>
+          <w:b/>
+        </w:rPr>
+        <w:t>楼板与墙体单侧</w:t>
+      </w:r>
+      <w:r>
+        <w:rPr>
+          <w:b/>
+        </w:rPr>
+        <w:t>{% else %}</w:t>
+      </w:r>
+      <w:r>
+        <w:rPr>
+          <w:b/>
+        </w:rPr>
+        <w:t>墙体</w:t>
+      </w:r>
+      <w:r>
+        <w:rPr>
+          <w:b/>
+        </w:rPr>
+        <w:t>{% endif %}</w:t>
+      </w:r>
+      <w:r>
+        <w:rPr>
+          <w:b/>
+        </w:rPr>
+        <w:t>配筋计算结果</w:t>
       </w:r>
     </w:p>
     <w:bookmarkEnd w:id="32"/>
@@ -24900,7 +24918,7 @@
         <w:spacing w:line="300" w:lineRule="auto"/>
         <w:ind w:firstLineChars="200" w:firstLine="480"/>
         <w:rPr>
-          <w:rFonts w:hAnsi="宋体" w:hint="eastAsia"/>
+          <w:rFonts w:hAnsi="宋体"/>
         </w:rPr>
       </w:pPr>
       <w:r>
@@ -24963,35 +24981,43 @@
         <w:spacing w:line="300" w:lineRule="auto"/>
         <w:ind w:firstLineChars="200" w:firstLine="480"/>
         <w:rPr>
-          <w:rFonts w:hAnsi="宋体" w:hint="eastAsia"/>
-          <w:color w:val="EE0000"/>
-        </w:rPr>
-      </w:pPr>
-      <w:r>
-        <w:rPr>
           <w:rFonts w:hAnsi="宋体"/>
           <w:color w:val="EE0000"/>
         </w:rPr>
+      </w:pPr>
+      <w:r>
+        <w:rPr>
+          <w:rFonts w:hAnsi="宋体"/>
+          <w:color w:val="EE0000"/>
+        </w:rPr>
         <w:t>{% if include_slab_stress %}</w:t>
       </w:r>
-      <w:proofErr w:type="spellStart"/>
-      <w:proofErr w:type="gramStart"/>
-      <w:proofErr w:type="spellEnd"/>
-      <w:proofErr w:type="gramEnd"/>
     </w:p>
     <w:p>
       <w:pPr>
         <w:spacing w:line="300" w:lineRule="auto"/>
         <w:ind w:firstLineChars="200" w:firstLine="480"/>
         <w:rPr>
+          <w:rFonts w:hAnsi="宋体"/>
+        </w:rPr>
+      </w:pPr>
+      <w:r>
+        <w:rPr>
           <w:rFonts w:hAnsi="宋体" w:hint="eastAsia"/>
         </w:rPr>
-      </w:pPr>
+        <w:t>楼板的配筋计算结果如下。配筋结果为单侧配筋量、其单位为</w:t>
+      </w:r>
       <w:r>
         <w:rPr>
           <w:rFonts w:hAnsi="宋体" w:hint="eastAsia"/>
         </w:rPr>
-        <w:t>楼板的配筋计算结果如下。配筋结果为单侧配筋量、其单位为mm2/m。</w:t>
+        <w:t>mm2/m</w:t>
+      </w:r>
+      <w:r>
+        <w:rPr>
+          <w:rFonts w:hAnsi="宋体" w:hint="eastAsia"/>
+        </w:rPr>
+        <w:t>。</w:t>
       </w:r>
     </w:p>
     <w:p>
@@ -24999,28 +25025,24 @@
         <w:spacing w:line="300" w:lineRule="auto"/>
         <w:ind w:firstLineChars="200" w:firstLine="480"/>
         <w:rPr>
-          <w:rFonts w:hAnsi="宋体" w:hint="eastAsia"/>
-          <w:color w:val="EE0000"/>
-        </w:rPr>
-      </w:pPr>
-      <w:r>
-        <w:rPr>
           <w:rFonts w:hAnsi="宋体"/>
           <w:color w:val="EE0000"/>
         </w:rPr>
+      </w:pPr>
+      <w:r>
+        <w:rPr>
+          <w:rFonts w:hAnsi="宋体"/>
+          <w:color w:val="EE0000"/>
+        </w:rPr>
         <w:t>{% for item in slab_figures %}</w:t>
       </w:r>
-      <w:proofErr w:type="spellStart"/>
-      <w:proofErr w:type="gramStart"/>
-      <w:proofErr w:type="spellEnd"/>
-      <w:proofErr w:type="gramEnd"/>
     </w:p>
     <w:p>
       <w:pPr>
         <w:spacing w:line="300" w:lineRule="auto"/>
         <w:ind w:firstLineChars="200" w:firstLine="480"/>
         <w:rPr>
-          <w:rFonts w:hAnsi="宋体" w:hint="eastAsia"/>
+          <w:rFonts w:hAnsi="宋体"/>
           <w:color w:val="EE0000"/>
         </w:rPr>
       </w:pPr>
@@ -25030,13 +25052,16 @@
           <w:rFonts w:hAnsi="宋体"/>
           <w:color w:val="EE0000"/>
         </w:rPr>
-        <w:t>{{ item.image }}</w:t>
-      </w:r>
-      <w:proofErr w:type="spellStart"/>
+        <w:t>{{ item</w:t>
+      </w:r>
       <w:proofErr w:type="gramEnd"/>
-      <w:proofErr w:type="gramStart"/>
-      <w:proofErr w:type="spellEnd"/>
-      <w:proofErr w:type="gramEnd"/>
+      <w:r>
+        <w:rPr>
+          <w:rFonts w:hAnsi="宋体"/>
+          <w:color w:val="EE0000"/>
+        </w:rPr>
+        <w:t>.image }}</w:t>
+      </w:r>
     </w:p>
     <w:p>
       <w:pPr>
@@ -25044,53 +25069,69 @@
         <w:ind w:firstLineChars="200" w:firstLine="480"/>
         <w:jc w:val="center"/>
         <w:rPr>
+          <w:rFonts w:hAnsi="宋体"/>
+          <w:color w:val="EE0000"/>
+        </w:rPr>
+      </w:pPr>
+      <w:r>
+        <w:rPr>
           <w:rFonts w:hAnsi="宋体" w:hint="eastAsia"/>
           <w:color w:val="EE0000"/>
         </w:rPr>
-      </w:pPr>
+        <w:t>图</w:t>
+      </w:r>
       <w:r>
         <w:rPr>
           <w:rFonts w:hAnsi="宋体" w:hint="eastAsia"/>
           <w:color w:val="EE0000"/>
         </w:rPr>
-        <w:t>图{{ item.figure_number }} {{ item.caption }}配筋云图（mm2/m）</w:t>
-      </w:r>
-      <w:proofErr w:type="spellStart"/>
-      <w:proofErr w:type="spellEnd"/>
-      <w:proofErr w:type="spellStart"/>
-      <w:proofErr w:type="spellEnd"/>
+        <w:t>{{ item.figure_number }} {{ item.caption }}</w:t>
+      </w:r>
+      <w:r>
+        <w:rPr>
+          <w:rFonts w:hAnsi="宋体" w:hint="eastAsia"/>
+          <w:color w:val="EE0000"/>
+        </w:rPr>
+        <w:t>配筋云图（</w:t>
+      </w:r>
+      <w:r>
+        <w:rPr>
+          <w:rFonts w:hAnsi="宋体" w:hint="eastAsia"/>
+          <w:color w:val="EE0000"/>
+        </w:rPr>
+        <w:t>mm2/m</w:t>
+      </w:r>
+      <w:r>
+        <w:rPr>
+          <w:rFonts w:hAnsi="宋体" w:hint="eastAsia"/>
+          <w:color w:val="EE0000"/>
+        </w:rPr>
+        <w:t>）</w:t>
+      </w:r>
     </w:p>
     <w:p>
       <w:pPr>
         <w:spacing w:line="300" w:lineRule="auto"/>
         <w:ind w:firstLineChars="200" w:firstLine="480"/>
         <w:rPr>
-          <w:rFonts w:hAnsi="宋体" w:hint="eastAsia"/>
-          <w:color w:val="EE0000"/>
-        </w:rPr>
-      </w:pPr>
-      <w:r>
-        <w:rPr>
           <w:rFonts w:hAnsi="宋体"/>
           <w:color w:val="EE0000"/>
         </w:rPr>
+      </w:pPr>
+      <w:r>
+        <w:rPr>
+          <w:rFonts w:hAnsi="宋体"/>
+          <w:color w:val="EE0000"/>
+        </w:rPr>
         <w:t>{{ item.narrative }}</w:t>
       </w:r>
-      <w:proofErr w:type="spellStart"/>
-      <w:proofErr w:type="spellEnd"/>
-      <w:proofErr w:type="spellStart"/>
-      <w:proofErr w:type="spellEnd"/>
-      <w:proofErr w:type="spellStart"/>
-      <w:proofErr w:type="spellEnd"/>
-      <w:proofErr w:type="spellStart"/>
-      <w:proofErr w:type="spellEnd"/>
     </w:p>
     <w:p>
       <w:pPr>
         <w:spacing w:line="300" w:lineRule="auto"/>
         <w:ind w:firstLineChars="200" w:firstLine="480"/>
         <w:rPr>
-          <w:rFonts w:hAnsi="宋体" w:hint="eastAsia"/>
+          <w:rFonts w:hAnsi="宋体"/>
           <w:color w:val="EE0000"/>
         </w:rPr>
       </w:pPr>
@@ -25101,15 +25142,13 @@
         </w:rPr>
         <w:t>{% endfor %}</w:t>
       </w:r>
-      <w:proofErr w:type="spellStart"/>
-      <w:proofErr w:type="spellEnd"/>
     </w:p>
     <w:p>
       <w:pPr>
         <w:spacing w:line="300" w:lineRule="auto"/>
         <w:ind w:firstLineChars="200" w:firstLine="480"/>
         <w:rPr>
-          <w:rFonts w:hAnsi="宋体" w:hint="eastAsia"/>
+          <w:rFonts w:hAnsi="宋体"/>
           <w:color w:val="EE0000"/>
         </w:rPr>
       </w:pPr>
@@ -25120,15 +25159,13 @@
         </w:rPr>
         <w:t>{% endif %}</w:t>
       </w:r>
-      <w:proofErr w:type="spellStart"/>
-      <w:proofErr w:type="spellEnd"/>
     </w:p>
     <w:p>
       <w:pPr>
         <w:spacing w:line="300" w:lineRule="auto"/>
         <w:ind w:firstLineChars="200" w:firstLine="480"/>
         <w:rPr>
-          <w:rFonts w:hAnsi="宋体" w:hint="eastAsia"/>
+          <w:rFonts w:hAnsi="宋体"/>
         </w:rPr>
       </w:pPr>
       <w:r>
@@ -25180,46 +25217,38 @@
         <w:spacing w:line="300" w:lineRule="auto"/>
         <w:ind w:firstLineChars="200" w:firstLine="480"/>
         <w:rPr>
-          <w:rFonts w:hAnsi="宋体" w:hint="eastAsia"/>
-          <w:color w:val="EE0000"/>
-        </w:rPr>
-      </w:pPr>
-      <w:r>
-        <w:rPr>
           <w:rFonts w:hAnsi="宋体"/>
           <w:color w:val="EE0000"/>
         </w:rPr>
-        <w:t xml:space="preserve">{% for </w:t>
-      </w:r>
+      </w:pPr>
       <w:r>
         <w:rPr>
           <w:rFonts w:hAnsi="宋体"/>
           <w:color w:val="EE0000"/>
         </w:rPr>
-        <w:t>item</w:t>
+        <w:t xml:space="preserve">{% for </w:t>
       </w:r>
       <w:r>
         <w:rPr>
           <w:rFonts w:hAnsi="宋体"/>
           <w:color w:val="EE0000"/>
         </w:rPr>
-        <w:t xml:space="preserve"> in </w:t>
-      </w:r>
-      <w:proofErr w:type="spellStart"/>
+        <w:t>item</w:t>
+      </w:r>
       <w:r>
         <w:rPr>
           <w:rFonts w:hAnsi="宋体"/>
           <w:color w:val="EE0000"/>
         </w:rPr>
-        <w:t>reinforcement_</w:t>
-      </w:r>
-      <w:proofErr w:type="gramStart"/>
+        <w:t xml:space="preserve"> in </w:t>
+      </w:r>
+      <w:proofErr w:type="spellStart"/>
       <w:r>
         <w:rPr>
           <w:rFonts w:hAnsi="宋体"/>
           <w:color w:val="EE0000"/>
         </w:rPr>
-        <w:t>figures</w:t>
+        <w:t>reinforcement_figures</w:t>
       </w:r>
       <w:proofErr w:type="spellEnd"/>
       <w:r>
@@ -25229,71 +25258,54 @@
         </w:rPr>
         <w:t xml:space="preserve"> %}</w:t>
       </w:r>
-      <w:proofErr w:type="gramEnd"/>
     </w:p>
     <w:p>
       <w:pPr>
         <w:spacing w:line="300" w:lineRule="auto"/>
         <w:ind w:firstLineChars="200" w:firstLine="480"/>
         <w:rPr>
+          <w:rFonts w:hAnsi="宋体"/>
+          <w:color w:val="EE0000"/>
+        </w:rPr>
+      </w:pPr>
+      <w:proofErr w:type="gramStart"/>
+      <w:r>
+        <w:rPr>
+          <w:rFonts w:hAnsi="宋体"/>
+          <w:color w:val="EE0000"/>
+        </w:rPr>
+        <w:t>{{</w:t>
+      </w:r>
+      <w:r>
+        <w:rPr>
           <w:rFonts w:hAnsi="宋体" w:hint="eastAsia"/>
           <w:color w:val="EE0000"/>
         </w:rPr>
-      </w:pPr>
-      <w:proofErr w:type="gramStart"/>
+        <w:t xml:space="preserve"> </w:t>
+      </w:r>
+      <w:proofErr w:type="spellStart"/>
       <w:r>
         <w:rPr>
           <w:rFonts w:hAnsi="宋体"/>
           <w:color w:val="EE0000"/>
         </w:rPr>
-        <w:t>{{</w:t>
-      </w:r>
-      <w:r>
-        <w:rPr>
-          <w:rFonts w:hAnsi="宋体" w:hint="eastAsia"/>
-          <w:color w:val="EE0000"/>
-        </w:rPr>
-        <w:t xml:space="preserve"> </w:t>
-      </w:r>
-      <w:proofErr w:type="spellStart"/>
+        <w:t>item</w:t>
+      </w:r>
+      <w:proofErr w:type="gramEnd"/>
       <w:r>
         <w:rPr>
           <w:rFonts w:hAnsi="宋体"/>
           <w:color w:val="EE0000"/>
         </w:rPr>
-        <w:t>item</w:t>
-      </w:r>
-      <w:proofErr w:type="gramEnd"/>
+        <w:t>.image</w:t>
+      </w:r>
+      <w:proofErr w:type="spellEnd"/>
       <w:r>
         <w:rPr>
           <w:rFonts w:hAnsi="宋体"/>
           <w:color w:val="EE0000"/>
         </w:rPr>
-        <w:t>.</w:t>
-      </w:r>
-      <w:proofErr w:type="gramStart"/>
-      <w:r>
-        <w:rPr>
-          <w:rFonts w:hAnsi="宋体"/>
-          <w:color w:val="EE0000"/>
-        </w:rPr>
-        <w:t>image</w:t>
-      </w:r>
-      <w:proofErr w:type="spellEnd"/>
-      <w:r>
-        <w:rPr>
-          <w:rFonts w:hAnsi="宋体"/>
-          <w:color w:val="EE0000"/>
-        </w:rPr>
-        <w:t xml:space="preserve"> }</w:t>
-      </w:r>
-      <w:proofErr w:type="gramEnd"/>
-      <w:r>
-        <w:rPr>
-          <w:rFonts w:hAnsi="宋体"/>
-          <w:color w:val="EE0000"/>
-        </w:rPr>
-        <w:t>}</w:t>
+        <w:t xml:space="preserve"> }}</w:t>
       </w:r>
     </w:p>
     <w:p>
@@ -25302,7 +25314,7 @@
         <w:ind w:firstLineChars="200" w:firstLine="480"/>
         <w:jc w:val="center"/>
         <w:rPr>
-          <w:rFonts w:hAnsi="宋体" w:hint="eastAsia"/>
+          <w:rFonts w:hAnsi="宋体"/>
           <w:color w:val="EE0000"/>
         </w:rPr>
       </w:pPr>
@@ -25392,144 +25404,16 @@
         <w:spacing w:line="300" w:lineRule="auto"/>
         <w:ind w:firstLineChars="200" w:firstLine="480"/>
         <w:rPr>
-          <w:rFonts w:hAnsi="宋体" w:hint="eastAsia"/>
-          <w:color w:val="EE0000"/>
-        </w:rPr>
-      </w:pPr>
-      <w:r>
-        <w:rPr>
           <w:rFonts w:hAnsi="宋体"/>
           <w:color w:val="EE0000"/>
         </w:rPr>
-        <w:t>{{ item.narrative }}</w:t>
-      </w:r>
+      </w:pPr>
       <w:r>
         <w:rPr>
           <w:rFonts w:hAnsi="宋体"/>
           <w:color w:val="EE0000"/>
         </w:rPr>
-      </w:r>
-      <w:proofErr w:type="spellStart"/>
-      <w:r>
-        <w:rPr>
-          <w:rFonts w:hAnsi="宋体"/>
-          <w:color w:val="EE0000"/>
-        </w:rPr>
-      </w:r>
-      <w:proofErr w:type="spellEnd"/>
-      <w:r>
-        <w:rPr>
-          <w:rFonts w:hAnsi="宋体"/>
-          <w:color w:val="EE0000"/>
-        </w:rPr>
-      </w:r>
-      <w:r>
-        <w:rPr>
-          <w:rFonts w:hAnsi="宋体"/>
-          <w:color w:val="EE0000"/>
-        </w:rPr>
-      </w:r>
-      <w:r>
-        <w:rPr>
-          <w:rFonts w:hAnsi="宋体"/>
-          <w:color w:val="EE0000"/>
-        </w:rPr>
-      </w:r>
-      <w:proofErr w:type="spellStart"/>
-      <w:r>
-        <w:rPr>
-          <w:rFonts w:hAnsi="宋体"/>
-          <w:color w:val="EE0000"/>
-        </w:rPr>
-      </w:r>
-      <w:proofErr w:type="spellEnd"/>
-      <w:r>
-        <w:rPr>
-          <w:rFonts w:hAnsi="宋体"/>
-          <w:color w:val="EE0000"/>
-        </w:rPr>
-      </w:r>
-      <w:r>
-        <w:rPr>
-          <w:rFonts w:hAnsi="宋体"/>
-          <w:color w:val="EE0000"/>
-        </w:rPr>
-      </w:r>
-      <w:r>
-        <w:rPr>
-          <w:rFonts w:hAnsi="宋体"/>
-          <w:color w:val="EE0000"/>
-        </w:rPr>
-      </w:r>
-      <w:r>
-        <w:rPr>
-          <w:rFonts w:hAnsi="宋体"/>
-          <w:color w:val="EE0000"/>
-        </w:rPr>
-      </w:r>
-      <w:r>
-        <w:rPr>
-          <w:rFonts w:hAnsi="宋体"/>
-          <w:color w:val="EE0000"/>
-        </w:rPr>
-      </w:r>
-      <w:proofErr w:type="spellStart"/>
-      <w:r>
-        <w:rPr>
-          <w:rFonts w:hAnsi="宋体"/>
-          <w:color w:val="EE0000"/>
-        </w:rPr>
-      </w:r>
-      <w:proofErr w:type="spellEnd"/>
-      <w:r>
-        <w:rPr>
-          <w:rFonts w:hAnsi="宋体"/>
-          <w:color w:val="EE0000"/>
-        </w:rPr>
-      </w:r>
-      <w:r>
-        <w:rPr>
-          <w:rFonts w:hAnsi="宋体"/>
-          <w:color w:val="EE0000"/>
-        </w:rPr>
-      </w:r>
-      <w:r>
-        <w:rPr>
-          <w:rFonts w:hAnsi="宋体"/>
-          <w:color w:val="EE0000"/>
-        </w:rPr>
-      </w:r>
-      <w:proofErr w:type="spellStart"/>
-      <w:r>
-        <w:rPr>
-          <w:rFonts w:hAnsi="宋体"/>
-          <w:color w:val="EE0000"/>
-        </w:rPr>
-      </w:r>
-      <w:proofErr w:type="spellEnd"/>
-      <w:r>
-        <w:rPr>
-          <w:rFonts w:hAnsi="宋体"/>
-          <w:color w:val="EE0000"/>
-        </w:rPr>
-      </w:r>
-      <w:r>
-        <w:rPr>
-          <w:rFonts w:hAnsi="宋体"/>
-          <w:color w:val="EE0000"/>
-        </w:rPr>
-      </w:r>
-      <w:r>
-        <w:rPr>
-          <w:rFonts w:hAnsi="宋体"/>
-          <w:color w:val="EE0000"/>
-        </w:rPr>
-      </w:r>
-      <w:r>
-        <w:rPr>
-          <w:rFonts w:hAnsi="宋体"/>
-          <w:color w:val="EE0000"/>
-        </w:rPr>
+        <w:t>{{ item.narrative }}</w:t>
       </w:r>
     </w:p>
     <w:p>
@@ -25537,7 +25421,7 @@
         <w:spacing w:line="300" w:lineRule="auto"/>
         <w:ind w:firstLineChars="200" w:firstLine="480"/>
         <w:rPr>
-          <w:rFonts w:hAnsi="宋体" w:hint="eastAsia"/>
+          <w:rFonts w:hAnsi="宋体"/>
           <w:color w:val="EE0000"/>
         </w:rPr>
       </w:pPr>
@@ -25547,7 +25431,7 @@
         <w:spacing w:line="300" w:lineRule="auto"/>
         <w:ind w:firstLineChars="200" w:firstLine="480"/>
         <w:rPr>
-          <w:rFonts w:hAnsi="宋体" w:hint="eastAsia"/>
+          <w:rFonts w:hAnsi="宋体"/>
           <w:color w:val="EE0000"/>
         </w:rPr>
       </w:pPr>
@@ -25659,12 +25543,11 @@
         <w:rPr>
           <w:noProof/>
         </w:rPr>
-        <w:lastRenderedPageBreak/>
         <w:drawing>
-          <wp:inline distT="0" distB="0" distL="114300" distR="114300" wp14:anchorId="43ACE326" wp14:editId="5A930A83">
-            <wp:extent cx="5901690" cy="4067810"/>
-            <wp:effectExtent l="0" t="0" r="3810" b="8890"/>
-            <wp:docPr id="1" name="图片 3"/>
+          <wp:inline distT="0" distB="0" distL="114300" distR="114300" wp14:anchorId="4862A16A" wp14:editId="0AD73694">
+            <wp:extent cx="5513147" cy="6012380"/>
+            <wp:effectExtent l="0" t="0" r="0" b="0"/>
+            <wp:docPr id="3" name="图片 5"/>
             <wp:cNvGraphicFramePr>
               <a:graphicFrameLocks xmlns:a="http://schemas.openxmlformats.org/drawingml/2006/main" noChangeAspect="1"/>
             </wp:cNvGraphicFramePr>
@@ -25672,7 +25555,7 @@
               <a:graphicData uri="http://schemas.openxmlformats.org/drawingml/2006/picture">
                 <pic:pic xmlns:pic="http://schemas.openxmlformats.org/drawingml/2006/picture">
                   <pic:nvPicPr>
-                    <pic:cNvPr id="1" name="图片 3"/>
+                    <pic:cNvPr id="4" name="图片 5"/>
                     <pic:cNvPicPr>
                       <a:picLocks noChangeAspect="1"/>
                     </pic:cNvPicPr>
@@ -25686,7 +25569,7 @@
                   <pic:spPr>
                     <a:xfrm>
                       <a:off x="0" y="0"/>
-                      <a:ext cx="5901690" cy="4067810"/>
+                      <a:ext cx="5512587" cy="6011769"/>
                     </a:xfrm>
                     <a:prstGeom prst="rect">
                       <a:avLst/>
@@ -25707,15 +25590,65 @@
       <w:pPr>
         <w:jc w:val="center"/>
       </w:pPr>
+    </w:p>
+    <w:p>
+      <w:pPr>
+        <w:ind w:firstLineChars="350" w:firstLine="840"/>
+        <w:rPr>
+          <w:szCs w:val="24"/>
+        </w:rPr>
+      </w:pPr>
+      <w:r>
+        <w:rPr>
+          <w:rFonts w:hint="eastAsia"/>
+          <w:szCs w:val="24"/>
+        </w:rPr>
+        <w:t xml:space="preserve"> </w:t>
+      </w:r>
+      <w:r>
+        <w:rPr>
+          <w:szCs w:val="24"/>
+        </w:rPr>
+        <w:t xml:space="preserve">             </w:t>
+      </w:r>
+      <w:r>
+        <w:rPr>
+          <w:rFonts w:hint="eastAsia"/>
+          <w:szCs w:val="24"/>
+        </w:rPr>
+        <w:t xml:space="preserve">          </w:t>
+      </w:r>
+      <w:r>
+        <w:rPr>
+          <w:rFonts w:hint="eastAsia"/>
+          <w:szCs w:val="24"/>
+        </w:rPr>
+        <w:t>墙</w:t>
+      </w:r>
+      <w:r>
+        <w:rPr>
+          <w:szCs w:val="24"/>
+        </w:rPr>
+        <w:t>配筋方式示意图</w:t>
+      </w:r>
+    </w:p>
+    <w:p>
+      <w:pPr>
+        <w:rPr>
+          <w:rFonts w:hint="eastAsia"/>
+          <w:szCs w:val="24"/>
+        </w:rPr>
+      </w:pPr>
       <w:r>
         <w:rPr>
           <w:noProof/>
         </w:rPr>
+        <w:lastRenderedPageBreak/>
         <w:drawing>
-          <wp:inline distT="0" distB="0" distL="114300" distR="114300" wp14:anchorId="56071808" wp14:editId="6931DFF1">
-            <wp:extent cx="5900420" cy="3747770"/>
-            <wp:effectExtent l="0" t="0" r="5080" b="5080"/>
-            <wp:docPr id="2" name="图片 4"/>
+          <wp:inline distT="0" distB="0" distL="114300" distR="114300" wp14:anchorId="740B123A" wp14:editId="67C73D72">
+            <wp:extent cx="5513147" cy="6012380"/>
+            <wp:effectExtent l="0" t="0" r="0" b="0"/>
+            <wp:docPr id="1" name="图片 5"/>
             <wp:cNvGraphicFramePr>
               <a:graphicFrameLocks xmlns:a="http://schemas.openxmlformats.org/drawingml/2006/main" noChangeAspect="1"/>
             </wp:cNvGraphicFramePr>
@@ -25723,13 +25656,13 @@
               <a:graphicData uri="http://schemas.openxmlformats.org/drawingml/2006/picture">
                 <pic:pic xmlns:pic="http://schemas.openxmlformats.org/drawingml/2006/picture">
                   <pic:nvPicPr>
-                    <pic:cNvPr id="2" name="图片 4"/>
+                    <pic:cNvPr id="4" name="图片 5"/>
                     <pic:cNvPicPr>
                       <a:picLocks noChangeAspect="1"/>
                     </pic:cNvPicPr>
                   </pic:nvPicPr>
                   <pic:blipFill>
-                    <a:blip r:embed="rId16"/>
+                    <a:blip r:embed="rId15"/>
                     <a:stretch>
                       <a:fillRect/>
                     </a:stretch>
@@ -25737,7 +25670,7 @@
                   <pic:spPr>
                     <a:xfrm>
                       <a:off x="0" y="0"/>
-                      <a:ext cx="5900420" cy="3747770"/>
+                      <a:ext cx="5512587" cy="6011769"/>
                     </a:xfrm>
                     <a:prstGeom prst="rect">
                       <a:avLst/>
@@ -25756,975 +25689,20 @@
     </w:p>
     <w:p>
       <w:pPr>
-        <w:ind w:firstLineChars="350" w:firstLine="840"/>
+        <w:widowControl/>
+        <w:jc w:val="left"/>
         <w:rPr>
           <w:szCs w:val="24"/>
         </w:rPr>
       </w:pPr>
       <w:r>
         <w:rPr>
-          <w:rFonts w:hint="eastAsia"/>
           <w:szCs w:val="24"/>
         </w:rPr>
-        <w:t xml:space="preserve"> </w:t>
-      </w:r>
-      <w:r>
-        <w:rPr>
-          <w:szCs w:val="24"/>
-        </w:rPr>
-        <w:t xml:space="preserve">             </w:t>
-      </w:r>
-      <w:r>
-        <w:rPr>
-          <w:rFonts w:hint="eastAsia"/>
-          <w:szCs w:val="24"/>
-        </w:rPr>
-        <w:t xml:space="preserve">          </w:t>
-      </w:r>
-      <w:r>
-        <w:rPr>
-          <w:rFonts w:hint="eastAsia"/>
-          <w:szCs w:val="24"/>
-        </w:rPr>
-        <w:t>墙</w:t>
-      </w:r>
-      <w:r>
-        <w:rPr>
-          <w:szCs w:val="24"/>
-        </w:rPr>
-        <w:t>配筋方式示意图</w:t>
-      </w:r>
-    </w:p>
-    <w:p>
-      <w:pPr>
-        <w:rPr>
-          <w:szCs w:val="24"/>
-        </w:rPr>
-      </w:pPr>
-      <w:r>
-        <w:rPr>
-          <w:szCs w:val="24"/>
-        </w:rPr>
-        <w:t xml:space="preserve">(2) </w:t>
-      </w:r>
-      <w:r>
-        <w:rPr>
-          <w:rFonts w:hint="eastAsia"/>
-          <w:szCs w:val="24"/>
-        </w:rPr>
-        <w:t>墙</w:t>
-      </w:r>
-      <w:r>
-        <w:rPr>
-          <w:szCs w:val="24"/>
-        </w:rPr>
-        <w:t>配筋</w:t>
-      </w:r>
-      <w:r>
-        <w:rPr>
-          <w:rFonts w:hint="eastAsia"/>
-          <w:szCs w:val="24"/>
-        </w:rPr>
-        <w:t>简图</w:t>
-      </w:r>
-    </w:p>
-    <w:p>
-      <w:pPr>
-        <w:rPr>
-          <w:szCs w:val="24"/>
-        </w:rPr>
-      </w:pPr>
-      <w:r>
-        <w:rPr>
-          <w:noProof/>
-        </w:rPr>
-        <w:lastRenderedPageBreak/>
-        <w:drawing>
-          <wp:inline distT="0" distB="0" distL="114300" distR="114300" wp14:anchorId="3969161D" wp14:editId="0F823027">
-            <wp:extent cx="5900420" cy="1935480"/>
-            <wp:effectExtent l="0" t="0" r="5080" b="7620"/>
-            <wp:docPr id="6" name="图片 4"/>
-            <wp:cNvGraphicFramePr>
-              <a:graphicFrameLocks xmlns:a="http://schemas.openxmlformats.org/drawingml/2006/main" noChangeAspect="1"/>
-            </wp:cNvGraphicFramePr>
-            <a:graphic xmlns:a="http://schemas.openxmlformats.org/drawingml/2006/main">
-              <a:graphicData uri="http://schemas.openxmlformats.org/drawingml/2006/picture">
-                <pic:pic xmlns:pic="http://schemas.openxmlformats.org/drawingml/2006/picture">
-                  <pic:nvPicPr>
-                    <pic:cNvPr id="6" name="图片 4"/>
-                    <pic:cNvPicPr>
-                      <a:picLocks noChangeAspect="1"/>
-                    </pic:cNvPicPr>
-                  </pic:nvPicPr>
-                  <pic:blipFill>
-                    <a:blip r:embed="rId17"/>
-                    <a:stretch>
-                      <a:fillRect/>
-                    </a:stretch>
-                  </pic:blipFill>
-                  <pic:spPr>
-                    <a:xfrm>
-                      <a:off x="0" y="0"/>
-                      <a:ext cx="5900420" cy="1935480"/>
-                    </a:xfrm>
-                    <a:prstGeom prst="rect">
-                      <a:avLst/>
-                    </a:prstGeom>
-                    <a:noFill/>
-                    <a:ln>
-                      <a:noFill/>
-                    </a:ln>
-                  </pic:spPr>
-                </pic:pic>
-              </a:graphicData>
-            </a:graphic>
-          </wp:inline>
-        </w:drawing>
-      </w:r>
-    </w:p>
-    <w:p>
-      <w:pPr>
-        <w:rPr>
-          <w:szCs w:val="24"/>
-        </w:rPr>
-      </w:pPr>
-      <w:r>
-        <w:rPr>
-          <w:noProof/>
-        </w:rPr>
-        <w:drawing>
-          <wp:inline distT="0" distB="0" distL="114300" distR="114300" wp14:anchorId="107E04F0" wp14:editId="4D902A94">
-            <wp:extent cx="5894070" cy="2630170"/>
-            <wp:effectExtent l="0" t="0" r="11430" b="17780"/>
-            <wp:docPr id="7" name="图片 5"/>
-            <wp:cNvGraphicFramePr>
-              <a:graphicFrameLocks xmlns:a="http://schemas.openxmlformats.org/drawingml/2006/main" noChangeAspect="1"/>
-            </wp:cNvGraphicFramePr>
-            <a:graphic xmlns:a="http://schemas.openxmlformats.org/drawingml/2006/main">
-              <a:graphicData uri="http://schemas.openxmlformats.org/drawingml/2006/picture">
-                <pic:pic xmlns:pic="http://schemas.openxmlformats.org/drawingml/2006/picture">
-                  <pic:nvPicPr>
-                    <pic:cNvPr id="7" name="图片 5"/>
-                    <pic:cNvPicPr>
-                      <a:picLocks noChangeAspect="1"/>
-                    </pic:cNvPicPr>
-                  </pic:nvPicPr>
-                  <pic:blipFill>
-                    <a:blip r:embed="rId18"/>
-                    <a:stretch>
-                      <a:fillRect/>
-                    </a:stretch>
-                  </pic:blipFill>
-                  <pic:spPr>
-                    <a:xfrm>
-                      <a:off x="0" y="0"/>
-                      <a:ext cx="5894070" cy="2630170"/>
-                    </a:xfrm>
-                    <a:prstGeom prst="rect">
-                      <a:avLst/>
-                    </a:prstGeom>
-                    <a:noFill/>
-                    <a:ln>
-                      <a:noFill/>
-                    </a:ln>
-                  </pic:spPr>
-                </pic:pic>
-              </a:graphicData>
-            </a:graphic>
-          </wp:inline>
-        </w:drawing>
-      </w:r>
-    </w:p>
-    <w:p>
-      <w:pPr>
-        <w:rPr>
-          <w:szCs w:val="24"/>
-        </w:rPr>
-      </w:pPr>
-      <w:r>
-        <w:rPr>
-          <w:noProof/>
-        </w:rPr>
-        <w:drawing>
-          <wp:inline distT="0" distB="0" distL="114300" distR="114300" wp14:anchorId="2EBE3CDE" wp14:editId="5331E6F7">
-            <wp:extent cx="5900420" cy="1968500"/>
-            <wp:effectExtent l="0" t="0" r="5080" b="12700"/>
-            <wp:docPr id="8" name="图片 6"/>
-            <wp:cNvGraphicFramePr>
-              <a:graphicFrameLocks xmlns:a="http://schemas.openxmlformats.org/drawingml/2006/main" noChangeAspect="1"/>
-            </wp:cNvGraphicFramePr>
-            <a:graphic xmlns:a="http://schemas.openxmlformats.org/drawingml/2006/main">
-              <a:graphicData uri="http://schemas.openxmlformats.org/drawingml/2006/picture">
-                <pic:pic xmlns:pic="http://schemas.openxmlformats.org/drawingml/2006/picture">
-                  <pic:nvPicPr>
-                    <pic:cNvPr id="8" name="图片 6"/>
-                    <pic:cNvPicPr>
-                      <a:picLocks noChangeAspect="1"/>
-                    </pic:cNvPicPr>
-                  </pic:nvPicPr>
-                  <pic:blipFill>
-                    <a:blip r:embed="rId19"/>
-                    <a:stretch>
-                      <a:fillRect/>
-                    </a:stretch>
-                  </pic:blipFill>
-                  <pic:spPr>
-                    <a:xfrm>
-                      <a:off x="0" y="0"/>
-                      <a:ext cx="5900420" cy="1968500"/>
-                    </a:xfrm>
-                    <a:prstGeom prst="rect">
-                      <a:avLst/>
-                    </a:prstGeom>
-                    <a:noFill/>
-                    <a:ln>
-                      <a:noFill/>
-                    </a:ln>
-                  </pic:spPr>
-                </pic:pic>
-              </a:graphicData>
-            </a:graphic>
-          </wp:inline>
-        </w:drawing>
-      </w:r>
-    </w:p>
-    <w:p>
-      <w:pPr>
-        <w:rPr>
-          <w:szCs w:val="24"/>
-        </w:rPr>
-      </w:pPr>
-      <w:r>
-        <w:rPr>
-          <w:noProof/>
-        </w:rPr>
-        <w:lastRenderedPageBreak/>
-        <w:drawing>
-          <wp:inline distT="0" distB="0" distL="114300" distR="114300" wp14:anchorId="3C767529" wp14:editId="27798129">
-            <wp:extent cx="5895340" cy="2015490"/>
-            <wp:effectExtent l="0" t="0" r="10160" b="3810"/>
-            <wp:docPr id="11" name="图片 7"/>
-            <wp:cNvGraphicFramePr>
-              <a:graphicFrameLocks xmlns:a="http://schemas.openxmlformats.org/drawingml/2006/main" noChangeAspect="1"/>
-            </wp:cNvGraphicFramePr>
-            <a:graphic xmlns:a="http://schemas.openxmlformats.org/drawingml/2006/main">
-              <a:graphicData uri="http://schemas.openxmlformats.org/drawingml/2006/picture">
-                <pic:pic xmlns:pic="http://schemas.openxmlformats.org/drawingml/2006/picture">
-                  <pic:nvPicPr>
-                    <pic:cNvPr id="11" name="图片 7"/>
-                    <pic:cNvPicPr>
-                      <a:picLocks noChangeAspect="1"/>
-                    </pic:cNvPicPr>
-                  </pic:nvPicPr>
-                  <pic:blipFill>
-                    <a:blip r:embed="rId20"/>
-                    <a:stretch>
-                      <a:fillRect/>
-                    </a:stretch>
-                  </pic:blipFill>
-                  <pic:spPr>
-                    <a:xfrm>
-                      <a:off x="0" y="0"/>
-                      <a:ext cx="5895340" cy="2015490"/>
-                    </a:xfrm>
-                    <a:prstGeom prst="rect">
-                      <a:avLst/>
-                    </a:prstGeom>
-                    <a:noFill/>
-                    <a:ln>
-                      <a:noFill/>
-                    </a:ln>
-                  </pic:spPr>
-                </pic:pic>
-              </a:graphicData>
-            </a:graphic>
-          </wp:inline>
-        </w:drawing>
-      </w:r>
-    </w:p>
-    <w:p>
-      <w:pPr>
-        <w:rPr>
-          <w:szCs w:val="24"/>
-        </w:rPr>
-      </w:pPr>
-      <w:r>
-        <w:rPr>
-          <w:noProof/>
-        </w:rPr>
-        <w:drawing>
-          <wp:inline distT="0" distB="0" distL="114300" distR="114300" wp14:anchorId="7B5CBE82" wp14:editId="30057F68">
-            <wp:extent cx="5899785" cy="4192270"/>
-            <wp:effectExtent l="0" t="0" r="5715" b="17780"/>
-            <wp:docPr id="12" name="图片 8"/>
-            <wp:cNvGraphicFramePr>
-              <a:graphicFrameLocks xmlns:a="http://schemas.openxmlformats.org/drawingml/2006/main" noChangeAspect="1"/>
-            </wp:cNvGraphicFramePr>
-            <a:graphic xmlns:a="http://schemas.openxmlformats.org/drawingml/2006/main">
-              <a:graphicData uri="http://schemas.openxmlformats.org/drawingml/2006/picture">
-                <pic:pic xmlns:pic="http://schemas.openxmlformats.org/drawingml/2006/picture">
-                  <pic:nvPicPr>
-                    <pic:cNvPr id="12" name="图片 8"/>
-                    <pic:cNvPicPr>
-                      <a:picLocks noChangeAspect="1"/>
-                    </pic:cNvPicPr>
-                  </pic:nvPicPr>
-                  <pic:blipFill>
-                    <a:blip r:embed="rId21"/>
-                    <a:stretch>
-                      <a:fillRect/>
-                    </a:stretch>
-                  </pic:blipFill>
-                  <pic:spPr>
-                    <a:xfrm>
-                      <a:off x="0" y="0"/>
-                      <a:ext cx="5899785" cy="4192270"/>
-                    </a:xfrm>
-                    <a:prstGeom prst="rect">
-                      <a:avLst/>
-                    </a:prstGeom>
-                    <a:noFill/>
-                    <a:ln>
-                      <a:noFill/>
-                    </a:ln>
-                  </pic:spPr>
-                </pic:pic>
-              </a:graphicData>
-            </a:graphic>
-          </wp:inline>
-        </w:drawing>
-      </w:r>
-    </w:p>
-    <w:p>
-      <w:pPr>
-        <w:rPr>
-          <w:szCs w:val="24"/>
-        </w:rPr>
-      </w:pPr>
-      <w:r>
-        <w:rPr>
-          <w:noProof/>
-        </w:rPr>
-        <w:lastRenderedPageBreak/>
-        <w:drawing>
-          <wp:inline distT="0" distB="0" distL="114300" distR="114300" wp14:anchorId="5DF58E20" wp14:editId="305A3732">
-            <wp:extent cx="1381760" cy="2434590"/>
-            <wp:effectExtent l="0" t="0" r="8890" b="3810"/>
-            <wp:docPr id="14" name="图片 9"/>
-            <wp:cNvGraphicFramePr>
-              <a:graphicFrameLocks xmlns:a="http://schemas.openxmlformats.org/drawingml/2006/main" noChangeAspect="1"/>
-            </wp:cNvGraphicFramePr>
-            <a:graphic xmlns:a="http://schemas.openxmlformats.org/drawingml/2006/main">
-              <a:graphicData uri="http://schemas.openxmlformats.org/drawingml/2006/picture">
-                <pic:pic xmlns:pic="http://schemas.openxmlformats.org/drawingml/2006/picture">
-                  <pic:nvPicPr>
-                    <pic:cNvPr id="14" name="图片 9"/>
-                    <pic:cNvPicPr>
-                      <a:picLocks noChangeAspect="1"/>
-                    </pic:cNvPicPr>
-                  </pic:nvPicPr>
-                  <pic:blipFill>
-                    <a:blip r:embed="rId22"/>
-                    <a:stretch>
-                      <a:fillRect/>
-                    </a:stretch>
-                  </pic:blipFill>
-                  <pic:spPr>
-                    <a:xfrm>
-                      <a:off x="0" y="0"/>
-                      <a:ext cx="1381760" cy="2434590"/>
-                    </a:xfrm>
-                    <a:prstGeom prst="rect">
-                      <a:avLst/>
-                    </a:prstGeom>
-                    <a:noFill/>
-                    <a:ln>
-                      <a:noFill/>
-                    </a:ln>
-                  </pic:spPr>
-                </pic:pic>
-              </a:graphicData>
-            </a:graphic>
-          </wp:inline>
-        </w:drawing>
-      </w:r>
-      <w:r>
-        <w:rPr>
-          <w:rFonts w:hint="eastAsia"/>
-        </w:rPr>
-        <w:t xml:space="preserve">   </w:t>
-      </w:r>
-      <w:r>
-        <w:rPr>
-          <w:noProof/>
-        </w:rPr>
-        <w:drawing>
-          <wp:inline distT="0" distB="0" distL="114300" distR="114300" wp14:anchorId="10043D47" wp14:editId="0DAF848B">
-            <wp:extent cx="1236345" cy="2456180"/>
-            <wp:effectExtent l="0" t="0" r="1905" b="1270"/>
-            <wp:docPr id="16" name="图片 10"/>
-            <wp:cNvGraphicFramePr>
-              <a:graphicFrameLocks xmlns:a="http://schemas.openxmlformats.org/drawingml/2006/main" noChangeAspect="1"/>
-            </wp:cNvGraphicFramePr>
-            <a:graphic xmlns:a="http://schemas.openxmlformats.org/drawingml/2006/main">
-              <a:graphicData uri="http://schemas.openxmlformats.org/drawingml/2006/picture">
-                <pic:pic xmlns:pic="http://schemas.openxmlformats.org/drawingml/2006/picture">
-                  <pic:nvPicPr>
-                    <pic:cNvPr id="16" name="图片 10"/>
-                    <pic:cNvPicPr>
-                      <a:picLocks noChangeAspect="1"/>
-                    </pic:cNvPicPr>
-                  </pic:nvPicPr>
-                  <pic:blipFill>
-                    <a:blip r:embed="rId23"/>
-                    <a:stretch>
-                      <a:fillRect/>
-                    </a:stretch>
-                  </pic:blipFill>
-                  <pic:spPr>
-                    <a:xfrm>
-                      <a:off x="0" y="0"/>
-                      <a:ext cx="1236345" cy="2456180"/>
-                    </a:xfrm>
-                    <a:prstGeom prst="rect">
-                      <a:avLst/>
-                    </a:prstGeom>
-                    <a:noFill/>
-                    <a:ln>
-                      <a:noFill/>
-                    </a:ln>
-                  </pic:spPr>
-                </pic:pic>
-              </a:graphicData>
-            </a:graphic>
-          </wp:inline>
-        </w:drawing>
-      </w:r>
-      <w:r>
-        <w:rPr>
-          <w:rFonts w:hint="eastAsia"/>
-        </w:rPr>
-        <w:t xml:space="preserve">   </w:t>
-      </w:r>
-      <w:r>
-        <w:rPr>
-          <w:noProof/>
-        </w:rPr>
-        <w:drawing>
-          <wp:inline distT="0" distB="0" distL="114300" distR="114300" wp14:anchorId="217C815E" wp14:editId="407BC7D1">
-            <wp:extent cx="1752600" cy="2459990"/>
-            <wp:effectExtent l="0" t="0" r="0" b="16510"/>
-            <wp:docPr id="17" name="图片 11"/>
-            <wp:cNvGraphicFramePr>
-              <a:graphicFrameLocks xmlns:a="http://schemas.openxmlformats.org/drawingml/2006/main" noChangeAspect="1"/>
-            </wp:cNvGraphicFramePr>
-            <a:graphic xmlns:a="http://schemas.openxmlformats.org/drawingml/2006/main">
-              <a:graphicData uri="http://schemas.openxmlformats.org/drawingml/2006/picture">
-                <pic:pic xmlns:pic="http://schemas.openxmlformats.org/drawingml/2006/picture">
-                  <pic:nvPicPr>
-                    <pic:cNvPr id="17" name="图片 11"/>
-                    <pic:cNvPicPr>
-                      <a:picLocks noChangeAspect="1"/>
-                    </pic:cNvPicPr>
-                  </pic:nvPicPr>
-                  <pic:blipFill>
-                    <a:blip r:embed="rId24"/>
-                    <a:stretch>
-                      <a:fillRect/>
-                    </a:stretch>
-                  </pic:blipFill>
-                  <pic:spPr>
-                    <a:xfrm>
-                      <a:off x="0" y="0"/>
-                      <a:ext cx="1752600" cy="2459990"/>
-                    </a:xfrm>
-                    <a:prstGeom prst="rect">
-                      <a:avLst/>
-                    </a:prstGeom>
-                    <a:noFill/>
-                    <a:ln>
-                      <a:noFill/>
-                    </a:ln>
-                  </pic:spPr>
-                </pic:pic>
-              </a:graphicData>
-            </a:graphic>
-          </wp:inline>
-        </w:drawing>
-      </w:r>
-    </w:p>
-    <w:p>
-      <w:pPr>
-        <w:rPr>
-          <w:szCs w:val="24"/>
-        </w:rPr>
-      </w:pPr>
-      <w:r>
-        <w:rPr>
-          <w:noProof/>
-        </w:rPr>
-        <w:drawing>
-          <wp:inline distT="0" distB="0" distL="114300" distR="114300" wp14:anchorId="67AD8081" wp14:editId="0627BE11">
-            <wp:extent cx="5901690" cy="2219325"/>
-            <wp:effectExtent l="0" t="0" r="3810" b="9525"/>
-            <wp:docPr id="18" name="图片 12"/>
-            <wp:cNvGraphicFramePr>
-              <a:graphicFrameLocks xmlns:a="http://schemas.openxmlformats.org/drawingml/2006/main" noChangeAspect="1"/>
-            </wp:cNvGraphicFramePr>
-            <a:graphic xmlns:a="http://schemas.openxmlformats.org/drawingml/2006/main">
-              <a:graphicData uri="http://schemas.openxmlformats.org/drawingml/2006/picture">
-                <pic:pic xmlns:pic="http://schemas.openxmlformats.org/drawingml/2006/picture">
-                  <pic:nvPicPr>
-                    <pic:cNvPr id="18" name="图片 12"/>
-                    <pic:cNvPicPr>
-                      <a:picLocks noChangeAspect="1"/>
-                    </pic:cNvPicPr>
-                  </pic:nvPicPr>
-                  <pic:blipFill>
-                    <a:blip r:embed="rId25"/>
-                    <a:stretch>
-                      <a:fillRect/>
-                    </a:stretch>
-                  </pic:blipFill>
-                  <pic:spPr>
-                    <a:xfrm>
-                      <a:off x="0" y="0"/>
-                      <a:ext cx="5901690" cy="2219325"/>
-                    </a:xfrm>
-                    <a:prstGeom prst="rect">
-                      <a:avLst/>
-                    </a:prstGeom>
-                    <a:noFill/>
-                    <a:ln>
-                      <a:noFill/>
-                    </a:ln>
-                  </pic:spPr>
-                </pic:pic>
-              </a:graphicData>
-            </a:graphic>
-          </wp:inline>
-        </w:drawing>
-      </w:r>
-    </w:p>
-    <w:p>
-      <w:pPr>
-        <w:rPr>
-          <w:szCs w:val="24"/>
-        </w:rPr>
-      </w:pPr>
-      <w:r>
-        <w:rPr>
-          <w:noProof/>
-        </w:rPr>
-        <w:drawing>
-          <wp:inline distT="0" distB="0" distL="114300" distR="114300" wp14:anchorId="3DB3468D" wp14:editId="21A667CA">
-            <wp:extent cx="5894070" cy="3178175"/>
-            <wp:effectExtent l="0" t="0" r="11430" b="3175"/>
-            <wp:docPr id="19" name="图片 13"/>
-            <wp:cNvGraphicFramePr>
-              <a:graphicFrameLocks xmlns:a="http://schemas.openxmlformats.org/drawingml/2006/main" noChangeAspect="1"/>
-            </wp:cNvGraphicFramePr>
-            <a:graphic xmlns:a="http://schemas.openxmlformats.org/drawingml/2006/main">
-              <a:graphicData uri="http://schemas.openxmlformats.org/drawingml/2006/picture">
-                <pic:pic xmlns:pic="http://schemas.openxmlformats.org/drawingml/2006/picture">
-                  <pic:nvPicPr>
-                    <pic:cNvPr id="19" name="图片 13"/>
-                    <pic:cNvPicPr>
-                      <a:picLocks noChangeAspect="1"/>
-                    </pic:cNvPicPr>
-                  </pic:nvPicPr>
-                  <pic:blipFill>
-                    <a:blip r:embed="rId26"/>
-                    <a:stretch>
-                      <a:fillRect/>
-                    </a:stretch>
-                  </pic:blipFill>
-                  <pic:spPr>
-                    <a:xfrm>
-                      <a:off x="0" y="0"/>
-                      <a:ext cx="5894070" cy="3178175"/>
-                    </a:xfrm>
-                    <a:prstGeom prst="rect">
-                      <a:avLst/>
-                    </a:prstGeom>
-                    <a:noFill/>
-                    <a:ln>
-                      <a:noFill/>
-                    </a:ln>
-                  </pic:spPr>
-                </pic:pic>
-              </a:graphicData>
-            </a:graphic>
-          </wp:inline>
-        </w:drawing>
-      </w:r>
-    </w:p>
-    <w:p>
-      <w:pPr>
-        <w:rPr>
-          <w:szCs w:val="24"/>
-        </w:rPr>
-      </w:pPr>
-      <w:r>
-        <w:rPr>
-          <w:noProof/>
-        </w:rPr>
-        <w:lastRenderedPageBreak/>
-        <w:drawing>
-          <wp:inline distT="0" distB="0" distL="114300" distR="114300" wp14:anchorId="07E87EB0" wp14:editId="7D50D24B">
-            <wp:extent cx="2279015" cy="2465070"/>
-            <wp:effectExtent l="0" t="0" r="6985" b="11430"/>
-            <wp:docPr id="20" name="图片 14"/>
-            <wp:cNvGraphicFramePr>
-              <a:graphicFrameLocks xmlns:a="http://schemas.openxmlformats.org/drawingml/2006/main" noChangeAspect="1"/>
-            </wp:cNvGraphicFramePr>
-            <a:graphic xmlns:a="http://schemas.openxmlformats.org/drawingml/2006/main">
-              <a:graphicData uri="http://schemas.openxmlformats.org/drawingml/2006/picture">
-                <pic:pic xmlns:pic="http://schemas.openxmlformats.org/drawingml/2006/picture">
-                  <pic:nvPicPr>
-                    <pic:cNvPr id="20" name="图片 14"/>
-                    <pic:cNvPicPr>
-                      <a:picLocks noChangeAspect="1"/>
-                    </pic:cNvPicPr>
-                  </pic:nvPicPr>
-                  <pic:blipFill>
-                    <a:blip r:embed="rId27"/>
-                    <a:stretch>
-                      <a:fillRect/>
-                    </a:stretch>
-                  </pic:blipFill>
-                  <pic:spPr>
-                    <a:xfrm>
-                      <a:off x="0" y="0"/>
-                      <a:ext cx="2279015" cy="2465070"/>
-                    </a:xfrm>
-                    <a:prstGeom prst="rect">
-                      <a:avLst/>
-                    </a:prstGeom>
-                    <a:noFill/>
-                    <a:ln>
-                      <a:noFill/>
-                    </a:ln>
-                  </pic:spPr>
-                </pic:pic>
-              </a:graphicData>
-            </a:graphic>
-          </wp:inline>
-        </w:drawing>
-      </w:r>
-      <w:r>
-        <w:rPr>
-          <w:rFonts w:hint="eastAsia"/>
-        </w:rPr>
-        <w:t xml:space="preserve">  </w:t>
-      </w:r>
-      <w:r>
-        <w:rPr>
-          <w:noProof/>
-        </w:rPr>
-        <w:drawing>
-          <wp:inline distT="0" distB="0" distL="114300" distR="114300" wp14:anchorId="20A07578" wp14:editId="46C73790">
-            <wp:extent cx="2747010" cy="2520950"/>
-            <wp:effectExtent l="0" t="0" r="15240" b="12700"/>
-            <wp:docPr id="21" name="图片 15"/>
-            <wp:cNvGraphicFramePr>
-              <a:graphicFrameLocks xmlns:a="http://schemas.openxmlformats.org/drawingml/2006/main" noChangeAspect="1"/>
-            </wp:cNvGraphicFramePr>
-            <a:graphic xmlns:a="http://schemas.openxmlformats.org/drawingml/2006/main">
-              <a:graphicData uri="http://schemas.openxmlformats.org/drawingml/2006/picture">
-                <pic:pic xmlns:pic="http://schemas.openxmlformats.org/drawingml/2006/picture">
-                  <pic:nvPicPr>
-                    <pic:cNvPr id="21" name="图片 15"/>
-                    <pic:cNvPicPr>
-                      <a:picLocks noChangeAspect="1"/>
-                    </pic:cNvPicPr>
-                  </pic:nvPicPr>
-                  <pic:blipFill>
-                    <a:blip r:embed="rId28"/>
-                    <a:stretch>
-                      <a:fillRect/>
-                    </a:stretch>
-                  </pic:blipFill>
-                  <pic:spPr>
-                    <a:xfrm>
-                      <a:off x="0" y="0"/>
-                      <a:ext cx="2747010" cy="2520950"/>
-                    </a:xfrm>
-                    <a:prstGeom prst="rect">
-                      <a:avLst/>
-                    </a:prstGeom>
-                    <a:noFill/>
-                    <a:ln>
-                      <a:noFill/>
-                    </a:ln>
-                  </pic:spPr>
-                </pic:pic>
-              </a:graphicData>
-            </a:graphic>
-          </wp:inline>
-        </w:drawing>
-      </w:r>
-    </w:p>
-    <w:p>
-      <w:pPr>
-        <w:rPr>
-          <w:szCs w:val="24"/>
-        </w:rPr>
-      </w:pPr>
-      <w:r>
-        <w:rPr>
-          <w:noProof/>
-        </w:rPr>
-        <w:drawing>
-          <wp:inline distT="0" distB="0" distL="114300" distR="114300" wp14:anchorId="63AB6747" wp14:editId="41A5F213">
-            <wp:extent cx="2148840" cy="2114550"/>
-            <wp:effectExtent l="0" t="0" r="3810" b="0"/>
-            <wp:docPr id="22" name="图片 16"/>
-            <wp:cNvGraphicFramePr>
-              <a:graphicFrameLocks xmlns:a="http://schemas.openxmlformats.org/drawingml/2006/main" noChangeAspect="1"/>
-            </wp:cNvGraphicFramePr>
-            <a:graphic xmlns:a="http://schemas.openxmlformats.org/drawingml/2006/main">
-              <a:graphicData uri="http://schemas.openxmlformats.org/drawingml/2006/picture">
-                <pic:pic xmlns:pic="http://schemas.openxmlformats.org/drawingml/2006/picture">
-                  <pic:nvPicPr>
-                    <pic:cNvPr id="22" name="图片 16"/>
-                    <pic:cNvPicPr>
-                      <a:picLocks noChangeAspect="1"/>
-                    </pic:cNvPicPr>
-                  </pic:nvPicPr>
-                  <pic:blipFill>
-                    <a:blip r:embed="rId29"/>
-                    <a:stretch>
-                      <a:fillRect/>
-                    </a:stretch>
-                  </pic:blipFill>
-                  <pic:spPr>
-                    <a:xfrm>
-                      <a:off x="0" y="0"/>
-                      <a:ext cx="2148840" cy="2114550"/>
-                    </a:xfrm>
-                    <a:prstGeom prst="rect">
-                      <a:avLst/>
-                    </a:prstGeom>
-                    <a:noFill/>
-                    <a:ln>
-                      <a:noFill/>
-                    </a:ln>
-                  </pic:spPr>
-                </pic:pic>
-              </a:graphicData>
-            </a:graphic>
-          </wp:inline>
-        </w:drawing>
-      </w:r>
-      <w:r>
-        <w:rPr>
-          <w:noProof/>
-        </w:rPr>
-        <w:drawing>
-          <wp:inline distT="0" distB="0" distL="114300" distR="114300" wp14:anchorId="1644903B" wp14:editId="5F5DEC4B">
-            <wp:extent cx="3253740" cy="2062480"/>
-            <wp:effectExtent l="0" t="0" r="3810" b="13970"/>
-            <wp:docPr id="23" name="图片 17"/>
-            <wp:cNvGraphicFramePr>
-              <a:graphicFrameLocks xmlns:a="http://schemas.openxmlformats.org/drawingml/2006/main" noChangeAspect="1"/>
-            </wp:cNvGraphicFramePr>
-            <a:graphic xmlns:a="http://schemas.openxmlformats.org/drawingml/2006/main">
-              <a:graphicData uri="http://schemas.openxmlformats.org/drawingml/2006/picture">
-                <pic:pic xmlns:pic="http://schemas.openxmlformats.org/drawingml/2006/picture">
-                  <pic:nvPicPr>
-                    <pic:cNvPr id="23" name="图片 17"/>
-                    <pic:cNvPicPr>
-                      <a:picLocks noChangeAspect="1"/>
-                    </pic:cNvPicPr>
-                  </pic:nvPicPr>
-                  <pic:blipFill>
-                    <a:blip r:embed="rId30"/>
-                    <a:stretch>
-                      <a:fillRect/>
-                    </a:stretch>
-                  </pic:blipFill>
-                  <pic:spPr>
-                    <a:xfrm>
-                      <a:off x="0" y="0"/>
-                      <a:ext cx="3253740" cy="2062480"/>
-                    </a:xfrm>
-                    <a:prstGeom prst="rect">
-                      <a:avLst/>
-                    </a:prstGeom>
-                    <a:noFill/>
-                    <a:ln>
-                      <a:noFill/>
-                    </a:ln>
-                  </pic:spPr>
-                </pic:pic>
-              </a:graphicData>
-            </a:graphic>
-          </wp:inline>
-        </w:drawing>
-      </w:r>
-    </w:p>
-    <w:p>
-      <w:pPr>
-        <w:jc w:val="center"/>
-        <w:rPr>
-          <w:szCs w:val="24"/>
-        </w:rPr>
-      </w:pPr>
-      <w:r>
-        <w:rPr>
-          <w:noProof/>
-        </w:rPr>
-        <w:drawing>
-          <wp:inline distT="0" distB="0" distL="114300" distR="114300" wp14:anchorId="313ED050" wp14:editId="51CA6973">
-            <wp:extent cx="5900420" cy="2695575"/>
-            <wp:effectExtent l="0" t="0" r="5080" b="9525"/>
-            <wp:docPr id="24" name="图片 18"/>
-            <wp:cNvGraphicFramePr>
-              <a:graphicFrameLocks xmlns:a="http://schemas.openxmlformats.org/drawingml/2006/main" noChangeAspect="1"/>
-            </wp:cNvGraphicFramePr>
-            <a:graphic xmlns:a="http://schemas.openxmlformats.org/drawingml/2006/main">
-              <a:graphicData uri="http://schemas.openxmlformats.org/drawingml/2006/picture">
-                <pic:pic xmlns:pic="http://schemas.openxmlformats.org/drawingml/2006/picture">
-                  <pic:nvPicPr>
-                    <pic:cNvPr id="24" name="图片 18"/>
-                    <pic:cNvPicPr>
-                      <a:picLocks noChangeAspect="1"/>
-                    </pic:cNvPicPr>
-                  </pic:nvPicPr>
-                  <pic:blipFill>
-                    <a:blip r:embed="rId31"/>
-                    <a:stretch>
-                      <a:fillRect/>
-                    </a:stretch>
-                  </pic:blipFill>
-                  <pic:spPr>
-                    <a:xfrm>
-                      <a:off x="0" y="0"/>
-                      <a:ext cx="5900420" cy="2695575"/>
-                    </a:xfrm>
-                    <a:prstGeom prst="rect">
-                      <a:avLst/>
-                    </a:prstGeom>
-                    <a:noFill/>
-                    <a:ln>
-                      <a:noFill/>
-                    </a:ln>
-                  </pic:spPr>
-                </pic:pic>
-              </a:graphicData>
-            </a:graphic>
-          </wp:inline>
-        </w:drawing>
-      </w:r>
-    </w:p>
-    <w:p>
-      <w:pPr>
-        <w:jc w:val="center"/>
-        <w:rPr>
-          <w:szCs w:val="24"/>
-        </w:rPr>
-      </w:pPr>
-      <w:r>
-        <w:rPr>
-          <w:noProof/>
-        </w:rPr>
-        <w:lastRenderedPageBreak/>
-        <w:drawing>
-          <wp:inline distT="0" distB="0" distL="114300" distR="114300" wp14:anchorId="5D3C3931" wp14:editId="6A6AF386">
-            <wp:extent cx="4655185" cy="3604895"/>
-            <wp:effectExtent l="0" t="0" r="12065" b="14605"/>
-            <wp:docPr id="25" name="图片 19"/>
-            <wp:cNvGraphicFramePr>
-              <a:graphicFrameLocks xmlns:a="http://schemas.openxmlformats.org/drawingml/2006/main" noChangeAspect="1"/>
-            </wp:cNvGraphicFramePr>
-            <a:graphic xmlns:a="http://schemas.openxmlformats.org/drawingml/2006/main">
-              <a:graphicData uri="http://schemas.openxmlformats.org/drawingml/2006/picture">
-                <pic:pic xmlns:pic="http://schemas.openxmlformats.org/drawingml/2006/picture">
-                  <pic:nvPicPr>
-                    <pic:cNvPr id="25" name="图片 19"/>
-                    <pic:cNvPicPr>
-                      <a:picLocks noChangeAspect="1"/>
-                    </pic:cNvPicPr>
-                  </pic:nvPicPr>
-                  <pic:blipFill>
-                    <a:blip r:embed="rId32"/>
-                    <a:stretch>
-                      <a:fillRect/>
-                    </a:stretch>
-                  </pic:blipFill>
-                  <pic:spPr>
-                    <a:xfrm>
-                      <a:off x="0" y="0"/>
-                      <a:ext cx="4655185" cy="3604895"/>
-                    </a:xfrm>
-                    <a:prstGeom prst="rect">
-                      <a:avLst/>
-                    </a:prstGeom>
-                    <a:noFill/>
-                    <a:ln>
-                      <a:noFill/>
-                    </a:ln>
-                  </pic:spPr>
-                </pic:pic>
-              </a:graphicData>
-            </a:graphic>
-          </wp:inline>
-        </w:drawing>
-      </w:r>
-    </w:p>
-    <w:p>
-      <w:pPr>
-        <w:rPr>
-          <w:szCs w:val="24"/>
-        </w:rPr>
-      </w:pPr>
-      <w:r>
-        <w:rPr>
-          <w:noProof/>
-        </w:rPr>
-        <w:drawing>
-          <wp:inline distT="0" distB="0" distL="114300" distR="114300" wp14:anchorId="240D5D02" wp14:editId="2FB5DCD6">
-            <wp:extent cx="5894070" cy="3284220"/>
-            <wp:effectExtent l="0" t="0" r="11430" b="11430"/>
-            <wp:docPr id="26" name="图片 20"/>
-            <wp:cNvGraphicFramePr>
-              <a:graphicFrameLocks xmlns:a="http://schemas.openxmlformats.org/drawingml/2006/main" noChangeAspect="1"/>
-            </wp:cNvGraphicFramePr>
-            <a:graphic xmlns:a="http://schemas.openxmlformats.org/drawingml/2006/main">
-              <a:graphicData uri="http://schemas.openxmlformats.org/drawingml/2006/picture">
-                <pic:pic xmlns:pic="http://schemas.openxmlformats.org/drawingml/2006/picture">
-                  <pic:nvPicPr>
-                    <pic:cNvPr id="26" name="图片 20"/>
-                    <pic:cNvPicPr>
-                      <a:picLocks noChangeAspect="1"/>
-                    </pic:cNvPicPr>
-                  </pic:nvPicPr>
-                  <pic:blipFill>
-                    <a:blip r:embed="rId33"/>
-                    <a:stretch>
-                      <a:fillRect/>
-                    </a:stretch>
-                  </pic:blipFill>
-                  <pic:spPr>
-                    <a:xfrm>
-                      <a:off x="0" y="0"/>
-                      <a:ext cx="5894070" cy="3284220"/>
-                    </a:xfrm>
-                    <a:prstGeom prst="rect">
-                      <a:avLst/>
-                    </a:prstGeom>
-                    <a:noFill/>
-                    <a:ln>
-                      <a:noFill/>
-                    </a:ln>
-                  </pic:spPr>
-                </pic:pic>
-              </a:graphicData>
-            </a:graphic>
-          </wp:inline>
-        </w:drawing>
-      </w:r>
+        <w:br w:type="page"/>
+      </w:r>
+      <w:bookmarkStart w:id="33" w:name="_GoBack"/>
+      <w:bookmarkEnd w:id="33"/>
     </w:p>
     <w:p>
       <w:pPr>
@@ -26908,23 +25886,6 @@
               </w:rPr>
               <w:t>{%tr for row in actual_rebar_rows %}</w:t>
             </w:r>
-            <w:proofErr w:type="spellStart"/>
-            <w:r>
-              <w:rPr>
-                <w:color w:val="EE0000"/>
-              </w:rPr>
-            </w:r>
-            <w:r>
-              <w:rPr>
-                <w:color w:val="EE0000"/>
-              </w:rPr>
-            </w:r>
-            <w:proofErr w:type="spellEnd"/>
-            <w:r>
-              <w:rPr>
-                <w:color w:val="EE0000"/>
-              </w:rPr>
-            </w:r>
           </w:p>
         </w:tc>
         <w:tc>
@@ -26940,7 +25901,6 @@
                 <w:color w:val="EE0000"/>
               </w:rPr>
             </w:pPr>
-            <w:r/>
           </w:p>
         </w:tc>
         <w:tc>
@@ -26953,7 +25913,6 @@
               <w:jc w:val="center"/>
               <w:outlineLvl w:val="3"/>
             </w:pPr>
-            <w:r/>
           </w:p>
         </w:tc>
         <w:tc>
@@ -26969,7 +25928,6 @@
                 <w:color w:val="EE0000"/>
               </w:rPr>
             </w:pPr>
-            <w:r/>
           </w:p>
         </w:tc>
       </w:tr>
@@ -26992,13 +25950,14 @@
               <w:rPr>
                 <w:color w:val="EE0000"/>
               </w:rPr>
-              <w:t>{{ row.id }}</w:t>
+              <w:t>{{ row.id</w:t>
             </w:r>
             <w:proofErr w:type="gramEnd"/>
             <w:r>
               <w:rPr>
                 <w:color w:val="EE0000"/>
               </w:rPr>
+              <w:t xml:space="preserve"> }}</w:t>
             </w:r>
           </w:p>
         </w:tc>
@@ -27062,7 +26021,6 @@
                 <w:color w:val="EE0000"/>
               </w:rPr>
             </w:pPr>
-            <w:r/>
           </w:p>
         </w:tc>
         <w:tc>
@@ -27078,7 +26036,6 @@
                 <w:color w:val="EE0000"/>
               </w:rPr>
             </w:pPr>
-            <w:r/>
           </w:p>
         </w:tc>
         <w:tc>
@@ -27091,7 +26048,6 @@
               <w:jc w:val="center"/>
               <w:outlineLvl w:val="3"/>
             </w:pPr>
-            <w:r/>
           </w:p>
         </w:tc>
         <w:tc>
@@ -27112,24 +26068,21 @@
                 <w:color w:val="EE0000"/>
               </w:rPr>
               <w:t>{%tr endfor %}</w:t>
-            </w:r>
-            <w:proofErr w:type="spellStart"/>
-            <w:r>
-              <w:rPr>
-                <w:color w:val="EE0000"/>
-              </w:rPr>
-            </w:r>
-            <w:proofErr w:type="spellEnd"/>
-            <w:r>
-              <w:rPr>
-                <w:color w:val="EE0000"/>
-              </w:rPr>
             </w:r>
           </w:p>
         </w:tc>
       </w:tr>
     </w:tbl>
     <w:p/>
+    <w:p>
+      <w:pPr>
+        <w:widowControl/>
+        <w:jc w:val="left"/>
+      </w:pPr>
+      <w:r>
+        <w:br w:type="page"/>
+      </w:r>
+    </w:p>
     <w:p/>
     <w:p>
       <w:pPr>
@@ -27691,7 +26644,7 @@
               <w:jc w:val="center"/>
               <w:outlineLvl w:val="3"/>
               <w:rPr>
-                <w:rFonts w:hAnsi="宋体" w:hint="eastAsia"/>
+                <w:rFonts w:hAnsi="宋体"/>
                 <w:color w:val="EE0000"/>
               </w:rPr>
             </w:pPr>
@@ -27858,7 +26811,7 @@
               <w:jc w:val="center"/>
               <w:outlineLvl w:val="3"/>
               <w:rPr>
-                <w:rFonts w:hAnsi="宋体" w:hint="eastAsia"/>
+                <w:rFonts w:hAnsi="宋体"/>
                 <w:color w:val="EE0000"/>
               </w:rPr>
             </w:pPr>
@@ -28273,7 +27226,7 @@
               <w:jc w:val="center"/>
               <w:outlineLvl w:val="3"/>
               <w:rPr>
-                <w:rFonts w:hAnsi="宋体" w:hint="eastAsia"/>
+                <w:rFonts w:hAnsi="宋体"/>
                 <w:color w:val="EE0000"/>
               </w:rPr>
             </w:pPr>
@@ -28421,7 +27374,7 @@
       </w:tr>
     </w:tbl>
     <w:p>
-      <w:bookmarkStart w:id="33" w:name="_Toc25923"/>
+      <w:bookmarkStart w:id="34" w:name="_Toc25923"/>
     </w:p>
     <w:p>
       <w:pPr>
@@ -28433,9 +27386,6 @@
           <w:numId w:val="14"/>
         </w:numPr>
         <w:spacing w:beforeLines="0" w:before="156"/>
-        <w:rPr>
-          <w:rFonts w:hint="eastAsia"/>
-        </w:rPr>
       </w:pPr>
       <w:r>
         <w:rPr>
@@ -28446,7 +27396,7 @@
         </w:rPr>
         <w:t>裂缝验算</w:t>
       </w:r>
-      <w:bookmarkEnd w:id="33"/>
+      <w:bookmarkEnd w:id="34"/>
     </w:p>
     <w:p>
       <w:pPr>
@@ -29473,8 +28423,8 @@
       </w:r>
     </w:p>
     <w:sectPr>
-      <w:headerReference w:type="default" r:id="rId34"/>
-      <w:footerReference w:type="default" r:id="rId35"/>
+      <w:headerReference w:type="default" r:id="rId16"/>
+      <w:footerReference w:type="default" r:id="rId17"/>
       <w:pgSz w:w="11906" w:h="16838"/>
       <w:pgMar w:top="1389" w:right="1021" w:bottom="1134" w:left="1588" w:header="851" w:footer="992" w:gutter="0"/>
       <w:cols w:space="425"/>
@@ -29485,7 +28435,7 @@
 </file>
 
 <file path=word/endnotes.xml><?xml version="1.0" encoding="utf-8"?>
-<w:endnotes xmlns:wpc="http://schemas.microsoft.com/office/word/2010/wordprocessingCanvas" xmlns:cx="http://schemas.microsoft.com/office/drawing/2014/chartex" xmlns:cx1="http://schemas.microsoft.com/office/drawing/2015/9/8/chartex" xmlns:cx2="http://schemas.microsoft.com/office/drawing/2015/10/21/chartex" xmlns:cx3="http://schemas.microsoft.com/office/drawing/2016/5/9/chartex" xmlns:cx4="http://schemas.microsoft.com/office/drawing/2016/5/10/chartex" xmlns:cx5="http://schemas.microsoft.com/office/drawing/2016/5/11/chartex" xmlns:cx6="http://schemas.microsoft.com/office/drawing/2016/5/12/chartex" xmlns:cx7="http://schemas.microsoft.com/office/drawing/2016/5/13/chartex" xmlns:cx8="http://schemas.microsoft.com/office/drawing/2016/5/14/chartex" xmlns:mc="http://schemas.openxmlformats.org/markup-compatibility/2006" xmlns:aink="http://schemas.microsoft.com/office/drawing/2016/ink" xmlns:am3d="http://schemas.microsoft.com/office/drawing/2017/model3d" xmlns:o="urn:schemas-microsoft-com:office:office" xmlns:oel="http://schemas.microsoft.com/office/2019/extlst" xmlns:r="http://schemas.openxmlformats.org/officeDocument/2006/relationships" xmlns:m="http://schemas.openxmlformats.org/officeDocument/2006/math" xmlns:v="urn:schemas-microsoft-com:vml" xmlns:wp14="http://schemas.microsoft.com/office/word/2010/wordprocessingDrawing" xmlns:wp="http://schemas.openxmlformats.org/drawingml/2006/wordprocessingDrawing" xmlns:w10="urn:schemas-microsoft-com:office:word" xmlns:w="http://schemas.openxmlformats.org/wordprocessingml/2006/main" xmlns:w14="http://schemas.microsoft.com/office/word/2010/wordml" xmlns:w15="http://schemas.microsoft.com/office/word/2012/wordml" xmlns:w16cex="http://schemas.microsoft.com/office/word/2018/wordml/cex" xmlns:w16cid="http://schemas.microsoft.com/office/word/2016/wordml/cid" xmlns:w16="http://schemas.microsoft.com/office/word/2018/wordml" xmlns:w16du="http://schemas.microsoft.com/office/word/2023/wordml/word16du" xmlns:w16sdtdh="http://schemas.microsoft.com/office/word/2020/wordml/sdtdatahash" xmlns:w16sdtfl="http://schemas.microsoft.com/office/word/2024/wordml/sdtformatlock" xmlns:w16se="http://schemas.microsoft.com/office/word/2015/wordml/symex" xmlns:wpg="http://schemas.microsoft.com/office/word/2010/wordprocessingGroup" xmlns:wpi="http://schemas.microsoft.com/office/word/2010/wordprocessingInk" xmlns:wne="http://schemas.microsoft.com/office/word/2006/wordml" xmlns:wps="http://schemas.microsoft.com/office/word/2010/wordprocessingShape" mc:Ignorable="w14 w15 w16se w16cid w16 w16cex w16sdtdh w16sdtfl w16du wp14">
+<w:endnotes xmlns:wpc="http://schemas.microsoft.com/office/word/2010/wordprocessingCanvas" xmlns:cx="http://schemas.microsoft.com/office/drawing/2014/chartex" xmlns:cx1="http://schemas.microsoft.com/office/drawing/2015/9/8/chartex" xmlns:cx2="http://schemas.microsoft.com/office/drawing/2015/10/21/chartex" xmlns:cx3="http://schemas.microsoft.com/office/drawing/2016/5/9/chartex" xmlns:cx4="http://schemas.microsoft.com/office/drawing/2016/5/10/chartex" xmlns:cx5="http://schemas.microsoft.com/office/drawing/2016/5/11/chartex" xmlns:cx6="http://schemas.microsoft.com/office/drawing/2016/5/12/chartex" xmlns:cx7="http://schemas.microsoft.com/office/drawing/2016/5/13/chartex" xmlns:cx8="http://schemas.microsoft.com/office/drawing/2016/5/14/chartex" xmlns:mc="http://schemas.openxmlformats.org/markup-compatibility/2006" xmlns:aink="http://schemas.microsoft.com/office/drawing/2016/ink" xmlns:am3d="http://schemas.microsoft.com/office/drawing/2017/model3d" xmlns:o="urn:schemas-microsoft-com:office:office" xmlns:r="http://schemas.openxmlformats.org/officeDocument/2006/relationships" xmlns:m="http://schemas.openxmlformats.org/officeDocument/2006/math" xmlns:v="urn:schemas-microsoft-com:vml" xmlns:wp14="http://schemas.microsoft.com/office/word/2010/wordprocessingDrawing" xmlns:wp="http://schemas.openxmlformats.org/drawingml/2006/wordprocessingDrawing" xmlns:w10="urn:schemas-microsoft-com:office:word" xmlns:w="http://schemas.openxmlformats.org/wordprocessingml/2006/main" xmlns:w14="http://schemas.microsoft.com/office/word/2010/wordml" xmlns:w15="http://schemas.microsoft.com/office/word/2012/wordml" xmlns:w16cex="http://schemas.microsoft.com/office/word/2018/wordml/cex" xmlns:w16cid="http://schemas.microsoft.com/office/word/2016/wordml/cid" xmlns:w16="http://schemas.microsoft.com/office/word/2018/wordml" xmlns:w16se="http://schemas.microsoft.com/office/word/2015/wordml/symex" xmlns:wpg="http://schemas.microsoft.com/office/word/2010/wordprocessingGroup" xmlns:wpi="http://schemas.microsoft.com/office/word/2010/wordprocessingInk" xmlns:wne="http://schemas.microsoft.com/office/word/2006/wordml" xmlns:wps="http://schemas.microsoft.com/office/word/2010/wordprocessingShape" mc:Ignorable="w14 w15 w16se w16cid w16 w16cex wp14">
   <w:endnote w:type="separator" w:id="-1">
     <w:p>
       <w:r>
@@ -29504,7 +28454,7 @@
 </file>
 
 <file path=word/footer1.xml><?xml version="1.0" encoding="utf-8"?>
-<w:ftr xmlns:wpc="http://schemas.microsoft.com/office/word/2010/wordprocessingCanvas" xmlns:cx="http://schemas.microsoft.com/office/drawing/2014/chartex" xmlns:cx1="http://schemas.microsoft.com/office/drawing/2015/9/8/chartex" xmlns:cx2="http://schemas.microsoft.com/office/drawing/2015/10/21/chartex" xmlns:cx3="http://schemas.microsoft.com/office/drawing/2016/5/9/chartex" xmlns:cx4="http://schemas.microsoft.com/office/drawing/2016/5/10/chartex" xmlns:cx5="http://schemas.microsoft.com/office/drawing/2016/5/11/chartex" xmlns:cx6="http://schemas.microsoft.com/office/drawing/2016/5/12/chartex" xmlns:cx7="http://schemas.microsoft.com/office/drawing/2016/5/13/chartex" xmlns:cx8="http://schemas.microsoft.com/office/drawing/2016/5/14/chartex" xmlns:mc="http://schemas.openxmlformats.org/markup-compatibility/2006" xmlns:aink="http://schemas.microsoft.com/office/drawing/2016/ink" xmlns:am3d="http://schemas.microsoft.com/office/drawing/2017/model3d" xmlns:o="urn:schemas-microsoft-com:office:office" xmlns:oel="http://schemas.microsoft.com/office/2019/extlst" xmlns:r="http://schemas.openxmlformats.org/officeDocument/2006/relationships" xmlns:m="http://schemas.openxmlformats.org/officeDocument/2006/math" xmlns:v="urn:schemas-microsoft-com:vml" xmlns:wp14="http://schemas.microsoft.com/office/word/2010/wordprocessingDrawing" xmlns:wp="http://schemas.openxmlformats.org/drawingml/2006/wordprocessingDrawing" xmlns:w10="urn:schemas-microsoft-com:office:word" xmlns:w="http://schemas.openxmlformats.org/wordprocessingml/2006/main" xmlns:w14="http://schemas.microsoft.com/office/word/2010/wordml" xmlns:w15="http://schemas.microsoft.com/office/word/2012/wordml" xmlns:w16cex="http://schemas.microsoft.com/office/word/2018/wordml/cex" xmlns:w16cid="http://schemas.microsoft.com/office/word/2016/wordml/cid" xmlns:w16="http://schemas.microsoft.com/office/word/2018/wordml" xmlns:w16du="http://schemas.microsoft.com/office/word/2023/wordml/word16du" xmlns:w16sdtdh="http://schemas.microsoft.com/office/word/2020/wordml/sdtdatahash" xmlns:w16sdtfl="http://schemas.microsoft.com/office/word/2024/wordml/sdtformatlock" xmlns:w16se="http://schemas.microsoft.com/office/word/2015/wordml/symex" xmlns:wpg="http://schemas.microsoft.com/office/word/2010/wordprocessingGroup" xmlns:wpi="http://schemas.microsoft.com/office/word/2010/wordprocessingInk" xmlns:wne="http://schemas.microsoft.com/office/word/2006/wordml" xmlns:wps="http://schemas.microsoft.com/office/word/2010/wordprocessingShape" mc:Ignorable="w14 w15 w16se w16cid w16 w16cex w16sdtdh w16sdtfl w16du wp14">
+<w:ftr xmlns:wpc="http://schemas.microsoft.com/office/word/2010/wordprocessingCanvas" xmlns:cx="http://schemas.microsoft.com/office/drawing/2014/chartex" xmlns:cx1="http://schemas.microsoft.com/office/drawing/2015/9/8/chartex" xmlns:cx2="http://schemas.microsoft.com/office/drawing/2015/10/21/chartex" xmlns:cx3="http://schemas.microsoft.com/office/drawing/2016/5/9/chartex" xmlns:cx4="http://schemas.microsoft.com/office/drawing/2016/5/10/chartex" xmlns:cx5="http://schemas.microsoft.com/office/drawing/2016/5/11/chartex" xmlns:cx6="http://schemas.microsoft.com/office/drawing/2016/5/12/chartex" xmlns:cx7="http://schemas.microsoft.com/office/drawing/2016/5/13/chartex" xmlns:cx8="http://schemas.microsoft.com/office/drawing/2016/5/14/chartex" xmlns:mc="http://schemas.openxmlformats.org/markup-compatibility/2006" xmlns:aink="http://schemas.microsoft.com/office/drawing/2016/ink" xmlns:am3d="http://schemas.microsoft.com/office/drawing/2017/model3d" xmlns:o="urn:schemas-microsoft-com:office:office" xmlns:r="http://schemas.openxmlformats.org/officeDocument/2006/relationships" xmlns:m="http://schemas.openxmlformats.org/officeDocument/2006/math" xmlns:v="urn:schemas-microsoft-com:vml" xmlns:wp14="http://schemas.microsoft.com/office/word/2010/wordprocessingDrawing" xmlns:wp="http://schemas.openxmlformats.org/drawingml/2006/wordprocessingDrawing" xmlns:w10="urn:schemas-microsoft-com:office:word" xmlns:w="http://schemas.openxmlformats.org/wordprocessingml/2006/main" xmlns:w14="http://schemas.microsoft.com/office/word/2010/wordml" xmlns:w15="http://schemas.microsoft.com/office/word/2012/wordml" xmlns:w16cex="http://schemas.microsoft.com/office/word/2018/wordml/cex" xmlns:w16cid="http://schemas.microsoft.com/office/word/2016/wordml/cid" xmlns:w16="http://schemas.microsoft.com/office/word/2018/wordml" xmlns:w16se="http://schemas.microsoft.com/office/word/2015/wordml/symex" xmlns:wpg="http://schemas.microsoft.com/office/word/2010/wordprocessingGroup" xmlns:wpi="http://schemas.microsoft.com/office/word/2010/wordprocessingInk" xmlns:wne="http://schemas.microsoft.com/office/word/2006/wordml" xmlns:wps="http://schemas.microsoft.com/office/word/2010/wordprocessingShape" mc:Ignorable="w14 w15 w16se w16cid w16 w16cex wp14">
   <w:p>
     <w:pPr>
       <w:pStyle w:val="aff5"/>
@@ -29521,7 +28471,7 @@
 </file>
 
 <file path=word/footnotes.xml><?xml version="1.0" encoding="utf-8"?>
-<w:footnotes xmlns:wpc="http://schemas.microsoft.com/office/word/2010/wordprocessingCanvas" xmlns:cx="http://schemas.microsoft.com/office/drawing/2014/chartex" xmlns:cx1="http://schemas.microsoft.com/office/drawing/2015/9/8/chartex" xmlns:cx2="http://schemas.microsoft.com/office/drawing/2015/10/21/chartex" xmlns:cx3="http://schemas.microsoft.com/office/drawing/2016/5/9/chartex" xmlns:cx4="http://schemas.microsoft.com/office/drawing/2016/5/10/chartex" xmlns:cx5="http://schemas.microsoft.com/office/drawing/2016/5/11/chartex" xmlns:cx6="http://schemas.microsoft.com/office/drawing/2016/5/12/chartex" xmlns:cx7="http://schemas.microsoft.com/office/drawing/2016/5/13/chartex" xmlns:cx8="http://schemas.microsoft.com/office/drawing/2016/5/14/chartex" xmlns:mc="http://schemas.openxmlformats.org/markup-compatibility/2006" xmlns:aink="http://schemas.microsoft.com/office/drawing/2016/ink" xmlns:am3d="http://schemas.microsoft.com/office/drawing/2017/model3d" xmlns:o="urn:schemas-microsoft-com:office:office" xmlns:oel="http://schemas.microsoft.com/office/2019/extlst" xmlns:r="http://schemas.openxmlformats.org/officeDocument/2006/relationships" xmlns:m="http://schemas.openxmlformats.org/officeDocument/2006/math" xmlns:v="urn:schemas-microsoft-com:vml" xmlns:wp14="http://schemas.microsoft.com/office/word/2010/wordprocessingDrawing" xmlns:wp="http://schemas.openxmlformats.org/drawingml/2006/wordprocessingDrawing" xmlns:w10="urn:schemas-microsoft-com:office:word" xmlns:w="http://schemas.openxmlformats.org/wordprocessingml/2006/main" xmlns:w14="http://schemas.microsoft.com/office/word/2010/wordml" xmlns:w15="http://schemas.microsoft.com/office/word/2012/wordml" xmlns:w16cex="http://schemas.microsoft.com/office/word/2018/wordml/cex" xmlns:w16cid="http://schemas.microsoft.com/office/word/2016/wordml/cid" xmlns:w16="http://schemas.microsoft.com/office/word/2018/wordml" xmlns:w16du="http://schemas.microsoft.com/office/word/2023/wordml/word16du" xmlns:w16sdtdh="http://schemas.microsoft.com/office/word/2020/wordml/sdtdatahash" xmlns:w16sdtfl="http://schemas.microsoft.com/office/word/2024/wordml/sdtformatlock" xmlns:w16se="http://schemas.microsoft.com/office/word/2015/wordml/symex" xmlns:wpg="http://schemas.microsoft.com/office/word/2010/wordprocessingGroup" xmlns:wpi="http://schemas.microsoft.com/office/word/2010/wordprocessingInk" xmlns:wne="http://schemas.microsoft.com/office/word/2006/wordml" xmlns:wps="http://schemas.microsoft.com/office/word/2010/wordprocessingShape" mc:Ignorable="w14 w15 w16se w16cid w16 w16cex w16sdtdh w16sdtfl w16du wp14">
+<w:footnotes xmlns:wpc="http://schemas.microsoft.com/office/word/2010/wordprocessingCanvas" xmlns:cx="http://schemas.microsoft.com/office/drawing/2014/chartex" xmlns:cx1="http://schemas.microsoft.com/office/drawing/2015/9/8/chartex" xmlns:cx2="http://schemas.microsoft.com/office/drawing/2015/10/21/chartex" xmlns:cx3="http://schemas.microsoft.com/office/drawing/2016/5/9/chartex" xmlns:cx4="http://schemas.microsoft.com/office/drawing/2016/5/10/chartex" xmlns:cx5="http://schemas.microsoft.com/office/drawing/2016/5/11/chartex" xmlns:cx6="http://schemas.microsoft.com/office/drawing/2016/5/12/chartex" xmlns:cx7="http://schemas.microsoft.com/office/drawing/2016/5/13/chartex" xmlns:cx8="http://schemas.microsoft.com/office/drawing/2016/5/14/chartex" xmlns:mc="http://schemas.openxmlformats.org/markup-compatibility/2006" xmlns:aink="http://schemas.microsoft.com/office/drawing/2016/ink" xmlns:am3d="http://schemas.microsoft.com/office/drawing/2017/model3d" xmlns:o="urn:schemas-microsoft-com:office:office" xmlns:r="http://schemas.openxmlformats.org/officeDocument/2006/relationships" xmlns:m="http://schemas.openxmlformats.org/officeDocument/2006/math" xmlns:v="urn:schemas-microsoft-com:vml" xmlns:wp14="http://schemas.microsoft.com/office/word/2010/wordprocessingDrawing" xmlns:wp="http://schemas.openxmlformats.org/drawingml/2006/wordprocessingDrawing" xmlns:w10="urn:schemas-microsoft-com:office:word" xmlns:w="http://schemas.openxmlformats.org/wordprocessingml/2006/main" xmlns:w14="http://schemas.microsoft.com/office/word/2010/wordml" xmlns:w15="http://schemas.microsoft.com/office/word/2012/wordml" xmlns:w16cex="http://schemas.microsoft.com/office/word/2018/wordml/cex" xmlns:w16cid="http://schemas.microsoft.com/office/word/2016/wordml/cid" xmlns:w16="http://schemas.microsoft.com/office/word/2018/wordml" xmlns:w16se="http://schemas.microsoft.com/office/word/2015/wordml/symex" xmlns:wpg="http://schemas.microsoft.com/office/word/2010/wordprocessingGroup" xmlns:wpi="http://schemas.microsoft.com/office/word/2010/wordprocessingInk" xmlns:wne="http://schemas.microsoft.com/office/word/2006/wordml" xmlns:wps="http://schemas.microsoft.com/office/word/2010/wordprocessingShape" mc:Ignorable="w14 w15 w16se w16cid w16 w16cex wp14">
   <w:footnote w:type="separator" w:id="-1">
     <w:p>
       <w:r>
@@ -29540,7 +28490,7 @@
 </file>
 
 <file path=word/header1.xml><?xml version="1.0" encoding="utf-8"?>
-<w:hdr xmlns:wpc="http://schemas.microsoft.com/office/word/2010/wordprocessingCanvas" xmlns:cx="http://schemas.microsoft.com/office/drawing/2014/chartex" xmlns:cx1="http://schemas.microsoft.com/office/drawing/2015/9/8/chartex" xmlns:cx2="http://schemas.microsoft.com/office/drawing/2015/10/21/chartex" xmlns:cx3="http://schemas.microsoft.com/office/drawing/2016/5/9/chartex" xmlns:cx4="http://schemas.microsoft.com/office/drawing/2016/5/10/chartex" xmlns:cx5="http://schemas.microsoft.com/office/drawing/2016/5/11/chartex" xmlns:cx6="http://schemas.microsoft.com/office/drawing/2016/5/12/chartex" xmlns:cx7="http://schemas.microsoft.com/office/drawing/2016/5/13/chartex" xmlns:cx8="http://schemas.microsoft.com/office/drawing/2016/5/14/chartex" xmlns:mc="http://schemas.openxmlformats.org/markup-compatibility/2006" xmlns:aink="http://schemas.microsoft.com/office/drawing/2016/ink" xmlns:am3d="http://schemas.microsoft.com/office/drawing/2017/model3d" xmlns:o="urn:schemas-microsoft-com:office:office" xmlns:oel="http://schemas.microsoft.com/office/2019/extlst" xmlns:r="http://schemas.openxmlformats.org/officeDocument/2006/relationships" xmlns:m="http://schemas.openxmlformats.org/officeDocument/2006/math" xmlns:v="urn:schemas-microsoft-com:vml" xmlns:wp14="http://schemas.microsoft.com/office/word/2010/wordprocessingDrawing" xmlns:wp="http://schemas.openxmlformats.org/drawingml/2006/wordprocessingDrawing" xmlns:w10="urn:schemas-microsoft-com:office:word" xmlns:w="http://schemas.openxmlformats.org/wordprocessingml/2006/main" xmlns:w14="http://schemas.microsoft.com/office/word/2010/wordml" xmlns:w15="http://schemas.microsoft.com/office/word/2012/wordml" xmlns:w16cex="http://schemas.microsoft.com/office/word/2018/wordml/cex" xmlns:w16cid="http://schemas.microsoft.com/office/word/2016/wordml/cid" xmlns:w16="http://schemas.microsoft.com/office/word/2018/wordml" xmlns:w16du="http://schemas.microsoft.com/office/word/2023/wordml/word16du" xmlns:w16sdtdh="http://schemas.microsoft.com/office/word/2020/wordml/sdtdatahash" xmlns:w16sdtfl="http://schemas.microsoft.com/office/word/2024/wordml/sdtformatlock" xmlns:w16se="http://schemas.microsoft.com/office/word/2015/wordml/symex" xmlns:wpg="http://schemas.microsoft.com/office/word/2010/wordprocessingGroup" xmlns:wpi="http://schemas.microsoft.com/office/word/2010/wordprocessingInk" xmlns:wne="http://schemas.microsoft.com/office/word/2006/wordml" xmlns:wps="http://schemas.microsoft.com/office/word/2010/wordprocessingShape" mc:Ignorable="w14 w15 w16se w16cid w16 w16cex w16sdtdh w16sdtfl w16du wp14">
+<w:hdr xmlns:wpc="http://schemas.microsoft.com/office/word/2010/wordprocessingCanvas" xmlns:cx="http://schemas.microsoft.com/office/drawing/2014/chartex" xmlns:cx1="http://schemas.microsoft.com/office/drawing/2015/9/8/chartex" xmlns:cx2="http://schemas.microsoft.com/office/drawing/2015/10/21/chartex" xmlns:cx3="http://schemas.microsoft.com/office/drawing/2016/5/9/chartex" xmlns:cx4="http://schemas.microsoft.com/office/drawing/2016/5/10/chartex" xmlns:cx5="http://schemas.microsoft.com/office/drawing/2016/5/11/chartex" xmlns:cx6="http://schemas.microsoft.com/office/drawing/2016/5/12/chartex" xmlns:cx7="http://schemas.microsoft.com/office/drawing/2016/5/13/chartex" xmlns:cx8="http://schemas.microsoft.com/office/drawing/2016/5/14/chartex" xmlns:mc="http://schemas.openxmlformats.org/markup-compatibility/2006" xmlns:aink="http://schemas.microsoft.com/office/drawing/2016/ink" xmlns:am3d="http://schemas.microsoft.com/office/drawing/2017/model3d" xmlns:o="urn:schemas-microsoft-com:office:office" xmlns:r="http://schemas.openxmlformats.org/officeDocument/2006/relationships" xmlns:m="http://schemas.openxmlformats.org/officeDocument/2006/math" xmlns:v="urn:schemas-microsoft-com:vml" xmlns:wp14="http://schemas.microsoft.com/office/word/2010/wordprocessingDrawing" xmlns:wp="http://schemas.openxmlformats.org/drawingml/2006/wordprocessingDrawing" xmlns:w10="urn:schemas-microsoft-com:office:word" xmlns:w="http://schemas.openxmlformats.org/wordprocessingml/2006/main" xmlns:w14="http://schemas.microsoft.com/office/word/2010/wordml" xmlns:w15="http://schemas.microsoft.com/office/word/2012/wordml" xmlns:w16cex="http://schemas.microsoft.com/office/word/2018/wordml/cex" xmlns:w16cid="http://schemas.microsoft.com/office/word/2016/wordml/cid" xmlns:w16="http://schemas.microsoft.com/office/word/2018/wordml" xmlns:w16se="http://schemas.microsoft.com/office/word/2015/wordml/symex" xmlns:wpg="http://schemas.microsoft.com/office/word/2010/wordprocessingGroup" xmlns:wpi="http://schemas.microsoft.com/office/word/2010/wordprocessingInk" xmlns:wne="http://schemas.microsoft.com/office/word/2006/wordml" xmlns:wps="http://schemas.microsoft.com/office/word/2010/wordprocessingShape" mc:Ignorable="w14 w15 w16se w16cid w16 w16cex wp14">
   <w:p>
     <w:pPr>
       <w:pBdr>
@@ -29817,7 +28767,7 @@
 </file>
 
 <file path=word/numbering.xml><?xml version="1.0" encoding="utf-8"?>
-<w:numbering xmlns:wpc="http://schemas.microsoft.com/office/word/2010/wordprocessingCanvas" xmlns:cx="http://schemas.microsoft.com/office/drawing/2014/chartex" xmlns:cx1="http://schemas.microsoft.com/office/drawing/2015/9/8/chartex" xmlns:cx2="http://schemas.microsoft.com/office/drawing/2015/10/21/chartex" xmlns:cx3="http://schemas.microsoft.com/office/drawing/2016/5/9/chartex" xmlns:cx4="http://schemas.microsoft.com/office/drawing/2016/5/10/chartex" xmlns:cx5="http://schemas.microsoft.com/office/drawing/2016/5/11/chartex" xmlns:cx6="http://schemas.microsoft.com/office/drawing/2016/5/12/chartex" xmlns:cx7="http://schemas.microsoft.com/office/drawing/2016/5/13/chartex" xmlns:cx8="http://schemas.microsoft.com/office/drawing/2016/5/14/chartex" xmlns:mc="http://schemas.openxmlformats.org/markup-compatibility/2006" xmlns:aink="http://schemas.microsoft.com/office/drawing/2016/ink" xmlns:am3d="http://schemas.microsoft.com/office/drawing/2017/model3d" xmlns:o="urn:schemas-microsoft-com:office:office" xmlns:oel="http://schemas.microsoft.com/office/2019/extlst" xmlns:r="http://schemas.openxmlformats.org/officeDocument/2006/relationships" xmlns:m="http://schemas.openxmlformats.org/officeDocument/2006/math" xmlns:v="urn:schemas-microsoft-com:vml" xmlns:wp14="http://schemas.microsoft.com/office/word/2010/wordprocessingDrawing" xmlns:wp="http://schemas.openxmlformats.org/drawingml/2006/wordprocessingDrawing" xmlns:w10="urn:schemas-microsoft-com:office:word" xmlns:w="http://schemas.openxmlformats.org/wordprocessingml/2006/main" xmlns:w14="http://schemas.microsoft.com/office/word/2010/wordml" xmlns:w15="http://schemas.microsoft.com/office/word/2012/wordml" xmlns:w16cex="http://schemas.microsoft.com/office/word/2018/wordml/cex" xmlns:w16cid="http://schemas.microsoft.com/office/word/2016/wordml/cid" xmlns:w16="http://schemas.microsoft.com/office/word/2018/wordml" xmlns:w16du="http://schemas.microsoft.com/office/word/2023/wordml/word16du" xmlns:w16sdtdh="http://schemas.microsoft.com/office/word/2020/wordml/sdtdatahash" xmlns:w16sdtfl="http://schemas.microsoft.com/office/word/2024/wordml/sdtformatlock" xmlns:w16se="http://schemas.microsoft.com/office/word/2015/wordml/symex" xmlns:wpg="http://schemas.microsoft.com/office/word/2010/wordprocessingGroup" xmlns:wpi="http://schemas.microsoft.com/office/word/2010/wordprocessingInk" xmlns:wne="http://schemas.microsoft.com/office/word/2006/wordml" xmlns:wps="http://schemas.microsoft.com/office/word/2010/wordprocessingShape" mc:Ignorable="w14 w15 w16se w16cid w16 w16cex w16sdtdh w16sdtfl w16du wp14">
+<w:numbering xmlns:wpc="http://schemas.microsoft.com/office/word/2010/wordprocessingCanvas" xmlns:cx="http://schemas.microsoft.com/office/drawing/2014/chartex" xmlns:cx1="http://schemas.microsoft.com/office/drawing/2015/9/8/chartex" xmlns:cx2="http://schemas.microsoft.com/office/drawing/2015/10/21/chartex" xmlns:cx3="http://schemas.microsoft.com/office/drawing/2016/5/9/chartex" xmlns:cx4="http://schemas.microsoft.com/office/drawing/2016/5/10/chartex" xmlns:cx5="http://schemas.microsoft.com/office/drawing/2016/5/11/chartex" xmlns:cx6="http://schemas.microsoft.com/office/drawing/2016/5/12/chartex" xmlns:cx7="http://schemas.microsoft.com/office/drawing/2016/5/13/chartex" xmlns:cx8="http://schemas.microsoft.com/office/drawing/2016/5/14/chartex" xmlns:mc="http://schemas.openxmlformats.org/markup-compatibility/2006" xmlns:aink="http://schemas.microsoft.com/office/drawing/2016/ink" xmlns:am3d="http://schemas.microsoft.com/office/drawing/2017/model3d" xmlns:o="urn:schemas-microsoft-com:office:office" xmlns:r="http://schemas.openxmlformats.org/officeDocument/2006/relationships" xmlns:m="http://schemas.openxmlformats.org/officeDocument/2006/math" xmlns:v="urn:schemas-microsoft-com:vml" xmlns:wp14="http://schemas.microsoft.com/office/word/2010/wordprocessingDrawing" xmlns:wp="http://schemas.openxmlformats.org/drawingml/2006/wordprocessingDrawing" xmlns:w10="urn:schemas-microsoft-com:office:word" xmlns:w="http://schemas.openxmlformats.org/wordprocessingml/2006/main" xmlns:w14="http://schemas.microsoft.com/office/word/2010/wordml" xmlns:w15="http://schemas.microsoft.com/office/word/2012/wordml" xmlns:w16cex="http://schemas.microsoft.com/office/word/2018/wordml/cex" xmlns:w16cid="http://schemas.microsoft.com/office/word/2016/wordml/cid" xmlns:w16="http://schemas.microsoft.com/office/word/2018/wordml" xmlns:w16se="http://schemas.microsoft.com/office/word/2015/wordml/symex" xmlns:wpg="http://schemas.microsoft.com/office/word/2010/wordprocessingGroup" xmlns:wpi="http://schemas.microsoft.com/office/word/2010/wordprocessingInk" xmlns:wne="http://schemas.microsoft.com/office/word/2006/wordml" xmlns:wps="http://schemas.microsoft.com/office/word/2010/wordprocessingShape" mc:Ignorable="w14 w15 w16se w16cid w16 w16cex wp14">
   <w:abstractNum w:abstractNumId="0" w15:restartNumberingAfterBreak="0">
     <w:nsid w:val="D3F73608"/>
     <w:multiLevelType w:val="singleLevel"/>
@@ -30676,59 +29626,59 @@
       </w:rPr>
     </w:lvl>
   </w:abstractNum>
-  <w:num w:numId="1" w16cid:durableId="936403793">
+  <w:num w:numId="1">
     <w:abstractNumId w:val="15"/>
   </w:num>
-  <w:num w:numId="2" w16cid:durableId="1978219669">
+  <w:num w:numId="2">
     <w:abstractNumId w:val="4"/>
   </w:num>
-  <w:num w:numId="3" w16cid:durableId="730419125">
+  <w:num w:numId="3">
     <w:abstractNumId w:val="6"/>
   </w:num>
-  <w:num w:numId="4" w16cid:durableId="1893694088">
+  <w:num w:numId="4">
     <w:abstractNumId w:val="9"/>
   </w:num>
-  <w:num w:numId="5" w16cid:durableId="1595016381">
+  <w:num w:numId="5">
     <w:abstractNumId w:val="10"/>
   </w:num>
-  <w:num w:numId="6" w16cid:durableId="694621629">
+  <w:num w:numId="6">
     <w:abstractNumId w:val="7"/>
   </w:num>
-  <w:num w:numId="7" w16cid:durableId="2122265233">
+  <w:num w:numId="7">
     <w:abstractNumId w:val="3"/>
   </w:num>
-  <w:num w:numId="8" w16cid:durableId="1943295886">
+  <w:num w:numId="8">
     <w:abstractNumId w:val="8"/>
   </w:num>
-  <w:num w:numId="9" w16cid:durableId="984359041">
+  <w:num w:numId="9">
     <w:abstractNumId w:val="5"/>
   </w:num>
-  <w:num w:numId="10" w16cid:durableId="1604266969">
+  <w:num w:numId="10">
     <w:abstractNumId w:val="2"/>
   </w:num>
-  <w:num w:numId="11" w16cid:durableId="1175918199">
+  <w:num w:numId="11">
     <w:abstractNumId w:val="1"/>
   </w:num>
-  <w:num w:numId="12" w16cid:durableId="452477675">
+  <w:num w:numId="12">
     <w:abstractNumId w:val="14"/>
   </w:num>
-  <w:num w:numId="13" w16cid:durableId="1401176382">
+  <w:num w:numId="13">
     <w:abstractNumId w:val="11"/>
   </w:num>
-  <w:num w:numId="14" w16cid:durableId="1444617768">
+  <w:num w:numId="14">
     <w:abstractNumId w:val="13"/>
   </w:num>
-  <w:num w:numId="15" w16cid:durableId="94445948">
+  <w:num w:numId="15">
     <w:abstractNumId w:val="12"/>
   </w:num>
-  <w:num w:numId="16" w16cid:durableId="204218440">
+  <w:num w:numId="16">
     <w:abstractNumId w:val="0"/>
   </w:num>
 </w:numbering>
 </file>
 
 <file path=word/styles.xml><?xml version="1.0" encoding="utf-8"?>
-<w:styles xmlns:mc="http://schemas.openxmlformats.org/markup-compatibility/2006" xmlns:r="http://schemas.openxmlformats.org/officeDocument/2006/relationships" xmlns:w="http://schemas.openxmlformats.org/wordprocessingml/2006/main" xmlns:w14="http://schemas.microsoft.com/office/word/2010/wordml" xmlns:w15="http://schemas.microsoft.com/office/word/2012/wordml" xmlns:w16cex="http://schemas.microsoft.com/office/word/2018/wordml/cex" xmlns:w16cid="http://schemas.microsoft.com/office/word/2016/wordml/cid" xmlns:w16="http://schemas.microsoft.com/office/word/2018/wordml" xmlns:w16du="http://schemas.microsoft.com/office/word/2023/wordml/word16du" xmlns:w16sdtdh="http://schemas.microsoft.com/office/word/2020/wordml/sdtdatahash" xmlns:w16sdtfl="http://schemas.microsoft.com/office/word/2024/wordml/sdtformatlock" xmlns:w16se="http://schemas.microsoft.com/office/word/2015/wordml/symex" mc:Ignorable="w14 w15 w16se w16cid w16 w16cex w16sdtdh w16sdtfl w16du">
+<w:styles xmlns:mc="http://schemas.openxmlformats.org/markup-compatibility/2006" xmlns:r="http://schemas.openxmlformats.org/officeDocument/2006/relationships" xmlns:w="http://schemas.openxmlformats.org/wordprocessingml/2006/main" xmlns:w14="http://schemas.microsoft.com/office/word/2010/wordml" xmlns:w15="http://schemas.microsoft.com/office/word/2012/wordml" xmlns:w16cex="http://schemas.microsoft.com/office/word/2018/wordml/cex" xmlns:w16cid="http://schemas.microsoft.com/office/word/2016/wordml/cid" xmlns:w16="http://schemas.microsoft.com/office/word/2018/wordml" xmlns:w16se="http://schemas.microsoft.com/office/word/2015/wordml/symex" mc:Ignorable="w14 w15 w16se w16cid w16 w16cex">
   <w:docDefaults>
     <w:rPrDefault>
       <w:rPr>
@@ -36111,7 +35061,7 @@
 </file>
 
 <file path=customXml/itemProps1.xml><?xml version="1.0" encoding="utf-8"?>
-<ds:datastoreItem xmlns:ds="http://schemas.openxmlformats.org/officeDocument/2006/customXml" ds:itemID="{BFFA737F-44ED-4364-83D8-3179EA81B1E6}">
+<ds:datastoreItem xmlns:ds="http://schemas.openxmlformats.org/officeDocument/2006/customXml" ds:itemID="{51938F21-D3CF-4AB3-9D94-13BBC5703037}">
   <ds:schemaRefs>
     <ds:schemaRef ds:uri="http://schemas.openxmlformats.org/officeDocument/2006/bibliography"/>
   </ds:schemaRefs>

</xml_diff>